<commit_message>
create database and crud for all models
</commit_message>
<xml_diff>
--- a/ספרינטים.docx
+++ b/ספרינטים.docx
@@ -94,7 +94,25 @@
           <w:bCs/>
           <w:rtl/>
         </w:rPr>
-        <w:t>כך שתוכלי לסיים הכל תוך חודש ולהגיש בזמן</w:t>
+        <w:t xml:space="preserve">כך שתוכלי לסיים </w:t>
+      </w:r>
+      <w:proofErr w:type="spellStart"/>
+      <w:r>
+        <w:rPr>
+          <w:b/>
+          <w:bCs/>
+          <w:rtl/>
+        </w:rPr>
+        <w:t>הכל</w:t>
+      </w:r>
+      <w:proofErr w:type="spellEnd"/>
+      <w:r>
+        <w:rPr>
+          <w:b/>
+          <w:bCs/>
+          <w:rtl/>
+        </w:rPr>
+        <w:t xml:space="preserve"> תוך חודש ולהגיש בזמן</w:t>
       </w:r>
       <w:r>
         <w:rPr>
@@ -455,7 +473,39 @@
           <w:b/>
           <w:bCs/>
         </w:rPr>
-        <w:t>(POST /api/auth/register, POST /api/auth/login)</w:t>
+        <w:t>(POST /</w:t>
+      </w:r>
+      <w:proofErr w:type="spellStart"/>
+      <w:r>
+        <w:rPr>
+          <w:b/>
+          <w:bCs/>
+        </w:rPr>
+        <w:t>api</w:t>
+      </w:r>
+      <w:proofErr w:type="spellEnd"/>
+      <w:r>
+        <w:rPr>
+          <w:b/>
+          <w:bCs/>
+        </w:rPr>
+        <w:t>/auth/register, POST /</w:t>
+      </w:r>
+      <w:proofErr w:type="spellStart"/>
+      <w:r>
+        <w:rPr>
+          <w:b/>
+          <w:bCs/>
+        </w:rPr>
+        <w:t>api</w:t>
+      </w:r>
+      <w:proofErr w:type="spellEnd"/>
+      <w:r>
+        <w:rPr>
+          <w:b/>
+          <w:bCs/>
+        </w:rPr>
+        <w:t>/auth/login)</w:t>
       </w:r>
       <w:r>
         <w:rPr>
@@ -507,7 +557,23 @@
           <w:b/>
           <w:bCs/>
         </w:rPr>
-        <w:t>(POST /api/files)</w:t>
+        <w:t>(POST /</w:t>
+      </w:r>
+      <w:proofErr w:type="spellStart"/>
+      <w:r>
+        <w:rPr>
+          <w:b/>
+          <w:bCs/>
+        </w:rPr>
+        <w:t>api</w:t>
+      </w:r>
+      <w:proofErr w:type="spellEnd"/>
+      <w:r>
+        <w:rPr>
+          <w:b/>
+          <w:bCs/>
+        </w:rPr>
+        <w:t>/files)</w:t>
       </w:r>
       <w:r>
         <w:rPr>
@@ -989,8 +1055,17 @@
           <w:b/>
           <w:bCs/>
         </w:rPr>
-        <w:t>- FileTags</w:t>
-      </w:r>
+        <w:t xml:space="preserve">- </w:t>
+      </w:r>
+      <w:proofErr w:type="spellStart"/>
+      <w:r>
+        <w:rPr>
+          <w:b/>
+          <w:bCs/>
+        </w:rPr>
+        <w:t>FileTags</w:t>
+      </w:r>
+      <w:proofErr w:type="spellEnd"/>
       <w:r>
         <w:rPr>
           <w:b/>
@@ -1086,7 +1161,48 @@
           <w:b/>
           <w:bCs/>
         </w:rPr>
-        <w:t>(PUT /api/files/{fileId}/tags)</w:t>
+        <w:t>(PUT /</w:t>
+      </w:r>
+      <w:proofErr w:type="spellStart"/>
+      <w:r>
+        <w:rPr>
+          <w:b/>
+          <w:bCs/>
+        </w:rPr>
+        <w:t>api</w:t>
+      </w:r>
+      <w:proofErr w:type="spellEnd"/>
+      <w:r>
+        <w:rPr>
+          <w:b/>
+          <w:bCs/>
+        </w:rPr>
+        <w:t>/</w:t>
+      </w:r>
+      <w:proofErr w:type="gramStart"/>
+      <w:r>
+        <w:rPr>
+          <w:b/>
+          <w:bCs/>
+        </w:rPr>
+        <w:t>files/{</w:t>
+      </w:r>
+      <w:proofErr w:type="spellStart"/>
+      <w:proofErr w:type="gramEnd"/>
+      <w:r>
+        <w:rPr>
+          <w:b/>
+          <w:bCs/>
+        </w:rPr>
+        <w:t>fileId</w:t>
+      </w:r>
+      <w:proofErr w:type="spellEnd"/>
+      <w:r>
+        <w:rPr>
+          <w:b/>
+          <w:bCs/>
+        </w:rPr>
+        <w:t>}/tags)</w:t>
       </w:r>
       <w:r>
         <w:rPr>
@@ -1138,7 +1254,39 @@
           <w:b/>
           <w:bCs/>
         </w:rPr>
-        <w:t>(GET /api/files?tag=...)</w:t>
+        <w:t>(GET /</w:t>
+      </w:r>
+      <w:proofErr w:type="spellStart"/>
+      <w:r>
+        <w:rPr>
+          <w:b/>
+          <w:bCs/>
+        </w:rPr>
+        <w:t>api</w:t>
+      </w:r>
+      <w:proofErr w:type="spellEnd"/>
+      <w:r>
+        <w:rPr>
+          <w:b/>
+          <w:bCs/>
+        </w:rPr>
+        <w:t>/</w:t>
+      </w:r>
+      <w:proofErr w:type="spellStart"/>
+      <w:r>
+        <w:rPr>
+          <w:b/>
+          <w:bCs/>
+        </w:rPr>
+        <w:t>files?tag</w:t>
+      </w:r>
+      <w:proofErr w:type="spellEnd"/>
+      <w:r>
+        <w:rPr>
+          <w:b/>
+          <w:bCs/>
+        </w:rPr>
+        <w:t>=...)</w:t>
       </w:r>
     </w:p>
     <w:p>
@@ -1406,7 +1554,25 @@
           <w:bCs/>
           <w:rtl/>
         </w:rPr>
-        <w:t>ספרינט 3: ניהול אדמינים, הרשאות ודוחות (שבוע 3)</w:t>
+        <w:t xml:space="preserve">ספרינט 3: ניהול </w:t>
+      </w:r>
+      <w:proofErr w:type="spellStart"/>
+      <w:r>
+        <w:rPr>
+          <w:b/>
+          <w:bCs/>
+          <w:rtl/>
+        </w:rPr>
+        <w:t>אדמינים</w:t>
+      </w:r>
+      <w:proofErr w:type="spellEnd"/>
+      <w:r>
+        <w:rPr>
+          <w:b/>
+          <w:bCs/>
+          <w:rtl/>
+        </w:rPr>
+        <w:t>, הרשאות ודוחות (שבוע 3)</w:t>
       </w:r>
     </w:p>
     <w:p>
@@ -1591,7 +1757,55 @@
           <w:b/>
           <w:bCs/>
         </w:rPr>
-        <w:t xml:space="preserve"> (CRUD) (POST /api/admin/users, DELETE /api/admin/users/{userId})</w:t>
+        <w:t xml:space="preserve"> (CRUD) (POST /</w:t>
+      </w:r>
+      <w:proofErr w:type="spellStart"/>
+      <w:r>
+        <w:rPr>
+          <w:b/>
+          <w:bCs/>
+        </w:rPr>
+        <w:t>api</w:t>
+      </w:r>
+      <w:proofErr w:type="spellEnd"/>
+      <w:r>
+        <w:rPr>
+          <w:b/>
+          <w:bCs/>
+        </w:rPr>
+        <w:t>/admin/users, DELETE /</w:t>
+      </w:r>
+      <w:proofErr w:type="spellStart"/>
+      <w:r>
+        <w:rPr>
+          <w:b/>
+          <w:bCs/>
+        </w:rPr>
+        <w:t>api</w:t>
+      </w:r>
+      <w:proofErr w:type="spellEnd"/>
+      <w:r>
+        <w:rPr>
+          <w:b/>
+          <w:bCs/>
+        </w:rPr>
+        <w:t>/admin/users/{</w:t>
+      </w:r>
+      <w:proofErr w:type="spellStart"/>
+      <w:r>
+        <w:rPr>
+          <w:b/>
+          <w:bCs/>
+        </w:rPr>
+        <w:t>userId</w:t>
+      </w:r>
+      <w:proofErr w:type="spellEnd"/>
+      <w:r>
+        <w:rPr>
+          <w:b/>
+          <w:bCs/>
+        </w:rPr>
+        <w:t>})</w:t>
       </w:r>
       <w:r>
         <w:rPr>
@@ -1643,7 +1857,23 @@
           <w:b/>
           <w:bCs/>
         </w:rPr>
-        <w:t xml:space="preserve"> (GET /api/admin/reports)</w:t>
+        <w:t xml:space="preserve"> (GET /</w:t>
+      </w:r>
+      <w:proofErr w:type="spellStart"/>
+      <w:r>
+        <w:rPr>
+          <w:b/>
+          <w:bCs/>
+        </w:rPr>
+        <w:t>api</w:t>
+      </w:r>
+      <w:proofErr w:type="spellEnd"/>
+      <w:r>
+        <w:rPr>
+          <w:b/>
+          <w:bCs/>
+        </w:rPr>
+        <w:t>/admin/reports)</w:t>
       </w:r>
       <w:r>
         <w:rPr>
@@ -1744,7 +1974,43 @@
           <w:bCs/>
           <w:rtl/>
         </w:rPr>
-        <w:t>בניית דשבורד אדמין עם סטטיסטיקות על שימוש במערכת</w:t>
+        <w:t xml:space="preserve">בניית </w:t>
+      </w:r>
+      <w:proofErr w:type="spellStart"/>
+      <w:r>
+        <w:rPr>
+          <w:b/>
+          <w:bCs/>
+          <w:rtl/>
+        </w:rPr>
+        <w:t>דשבורד</w:t>
+      </w:r>
+      <w:proofErr w:type="spellEnd"/>
+      <w:r>
+        <w:rPr>
+          <w:b/>
+          <w:bCs/>
+          <w:rtl/>
+        </w:rPr>
+        <w:t xml:space="preserve"> </w:t>
+      </w:r>
+      <w:proofErr w:type="spellStart"/>
+      <w:r>
+        <w:rPr>
+          <w:b/>
+          <w:bCs/>
+          <w:rtl/>
+        </w:rPr>
+        <w:t>אדמין</w:t>
+      </w:r>
+      <w:proofErr w:type="spellEnd"/>
+      <w:r>
+        <w:rPr>
+          <w:b/>
+          <w:bCs/>
+          <w:rtl/>
+        </w:rPr>
+        <w:t xml:space="preserve"> עם סטטיסטיקות על שימוש במערכת</w:t>
       </w:r>
       <w:r>
         <w:rPr>
@@ -1905,7 +2171,25 @@
           <w:bCs/>
           <w:rtl/>
         </w:rPr>
-        <w:t>בדיקות הרשאות (משתמש רגיל מול אדמין)</w:t>
+        <w:t xml:space="preserve">בדיקות הרשאות (משתמש רגיל מול </w:t>
+      </w:r>
+      <w:proofErr w:type="spellStart"/>
+      <w:r>
+        <w:rPr>
+          <w:b/>
+          <w:bCs/>
+          <w:rtl/>
+        </w:rPr>
+        <w:t>אדמין</w:t>
+      </w:r>
+      <w:proofErr w:type="spellEnd"/>
+      <w:r>
+        <w:rPr>
+          <w:b/>
+          <w:bCs/>
+          <w:rtl/>
+        </w:rPr>
+        <w:t>)</w:t>
       </w:r>
       <w:r>
         <w:rPr>
@@ -2230,6 +2514,2812 @@
         <w:rPr>
           <w:b/>
           <w:bCs/>
+        </w:rPr>
+      </w:pPr>
+      <w:r>
+        <w:rPr>
+          <w:rFonts w:ascii="Segoe UI Emoji" w:hAnsi="Segoe UI Emoji" w:cs="Segoe UI Emoji"/>
+          <w:b/>
+          <w:bCs/>
+        </w:rPr>
+        <w:t>🔹</w:t>
+      </w:r>
+      <w:r>
+        <w:rPr>
+          <w:b/>
+          <w:bCs/>
+        </w:rPr>
+        <w:t xml:space="preserve"> </w:t>
+      </w:r>
+      <w:r>
+        <w:rPr>
+          <w:b/>
+          <w:bCs/>
+          <w:rtl/>
+        </w:rPr>
+        <w:t>ספרינט 1: העלאת קבצים וניהול בסיסי</w:t>
+      </w:r>
+      <w:r>
+        <w:rPr>
+          <w:b/>
+          <w:bCs/>
+        </w:rPr>
+        <w:t xml:space="preserve"> (File Upload &amp; Management)</w:t>
+      </w:r>
+    </w:p>
+    <w:p>
+      <w:pPr>
+        <w:jc w:val="center"/>
+        <w:rPr>
+          <w:b/>
+          <w:bCs/>
+        </w:rPr>
+      </w:pPr>
+      <w:r>
+        <w:rPr>
+          <w:rFonts w:ascii="Segoe UI Emoji" w:hAnsi="Segoe UI Emoji" w:cs="Segoe UI Emoji"/>
+          <w:b/>
+          <w:bCs/>
+        </w:rPr>
+        <w:t>📌</w:t>
+      </w:r>
+      <w:r>
+        <w:rPr>
+          <w:b/>
+          <w:bCs/>
+        </w:rPr>
+        <w:t xml:space="preserve"> </w:t>
+      </w:r>
+      <w:r>
+        <w:rPr>
+          <w:b/>
+          <w:bCs/>
+          <w:rtl/>
+        </w:rPr>
+        <w:t>מטרה</w:t>
+      </w:r>
+      <w:r>
+        <w:rPr>
+          <w:b/>
+          <w:bCs/>
+        </w:rPr>
+        <w:t xml:space="preserve">: </w:t>
+      </w:r>
+      <w:r>
+        <w:rPr>
+          <w:b/>
+          <w:bCs/>
+          <w:rtl/>
+        </w:rPr>
+        <w:t>יצירת מערכת שמאפשרת להעלות קבצים למערכת, לנהל אותם ולשמור מידע בסיסי במסד הנתונים</w:t>
+      </w:r>
+      <w:r>
+        <w:rPr>
+          <w:b/>
+          <w:bCs/>
+        </w:rPr>
+        <w:t>.</w:t>
+      </w:r>
+    </w:p>
+    <w:p>
+      <w:pPr>
+        <w:jc w:val="center"/>
+        <w:rPr>
+          <w:b/>
+          <w:bCs/>
+        </w:rPr>
+      </w:pPr>
+      <w:r>
+        <w:rPr>
+          <w:rFonts w:ascii="Segoe UI Emoji" w:hAnsi="Segoe UI Emoji" w:cs="Segoe UI Emoji"/>
+          <w:b/>
+          <w:bCs/>
+        </w:rPr>
+        <w:t>🔹</w:t>
+      </w:r>
+      <w:r>
+        <w:rPr>
+          <w:b/>
+          <w:bCs/>
+        </w:rPr>
+        <w:t xml:space="preserve"> </w:t>
+      </w:r>
+      <w:r>
+        <w:rPr>
+          <w:b/>
+          <w:bCs/>
+          <w:rtl/>
+        </w:rPr>
+        <w:t>משימות בספרינט זה</w:t>
+      </w:r>
+      <w:r>
+        <w:rPr>
+          <w:b/>
+          <w:bCs/>
+        </w:rPr>
+        <w:t>:</w:t>
+      </w:r>
+    </w:p>
+    <w:p>
+      <w:pPr>
+        <w:jc w:val="center"/>
+        <w:rPr>
+          <w:b/>
+          <w:bCs/>
+        </w:rPr>
+      </w:pPr>
+      <w:r>
+        <w:rPr>
+          <w:b/>
+          <w:bCs/>
+        </w:rPr>
+        <w:t>1️</w:t>
+      </w:r>
+      <w:r>
+        <w:rPr>
+          <w:rFonts w:ascii="Segoe UI Symbol" w:hAnsi="Segoe UI Symbol" w:cs="Segoe UI Symbol"/>
+          <w:b/>
+          <w:bCs/>
+        </w:rPr>
+        <w:t>⃣</w:t>
+      </w:r>
+      <w:r>
+        <w:rPr>
+          <w:b/>
+          <w:bCs/>
+        </w:rPr>
+        <w:t xml:space="preserve"> Backend - API </w:t>
+      </w:r>
+      <w:r>
+        <w:rPr>
+          <w:b/>
+          <w:bCs/>
+          <w:rtl/>
+        </w:rPr>
+        <w:t>לניהול קבצים</w:t>
+      </w:r>
+      <w:r>
+        <w:rPr>
+          <w:b/>
+          <w:bCs/>
+        </w:rPr>
+        <w:br/>
+      </w:r>
+      <w:r>
+        <w:rPr>
+          <w:rFonts w:ascii="Segoe UI Emoji" w:hAnsi="Segoe UI Emoji" w:cs="Segoe UI Emoji"/>
+          <w:b/>
+          <w:bCs/>
+        </w:rPr>
+        <w:t>✅</w:t>
+      </w:r>
+      <w:r>
+        <w:rPr>
+          <w:b/>
+          <w:bCs/>
+        </w:rPr>
+        <w:t xml:space="preserve"> </w:t>
+      </w:r>
+      <w:r>
+        <w:rPr>
+          <w:b/>
+          <w:bCs/>
+          <w:rtl/>
+        </w:rPr>
+        <w:t xml:space="preserve">יצירת מודל נתונים </w:t>
+      </w:r>
+      <w:r>
+        <w:rPr>
+          <w:b/>
+          <w:bCs/>
+        </w:rPr>
+        <w:t xml:space="preserve">(File) </w:t>
+      </w:r>
+      <w:r>
+        <w:rPr>
+          <w:b/>
+          <w:bCs/>
+          <w:rtl/>
+        </w:rPr>
+        <w:t>ושמירת קובץ במסד הנתונים</w:t>
+      </w:r>
+      <w:r>
+        <w:rPr>
+          <w:b/>
+          <w:bCs/>
+        </w:rPr>
+        <w:t>.</w:t>
+      </w:r>
+      <w:r>
+        <w:rPr>
+          <w:b/>
+          <w:bCs/>
+        </w:rPr>
+        <w:br/>
+      </w:r>
+      <w:r>
+        <w:rPr>
+          <w:rFonts w:ascii="Segoe UI Emoji" w:hAnsi="Segoe UI Emoji" w:cs="Segoe UI Emoji"/>
+          <w:b/>
+          <w:bCs/>
+        </w:rPr>
+        <w:t>✅</w:t>
+      </w:r>
+      <w:r>
+        <w:rPr>
+          <w:b/>
+          <w:bCs/>
+        </w:rPr>
+        <w:t xml:space="preserve"> </w:t>
+      </w:r>
+      <w:r>
+        <w:rPr>
+          <w:b/>
+          <w:bCs/>
+          <w:rtl/>
+        </w:rPr>
+        <w:t xml:space="preserve">הוספת </w:t>
+      </w:r>
+      <w:r>
+        <w:rPr>
+          <w:b/>
+          <w:bCs/>
+        </w:rPr>
+        <w:t xml:space="preserve">API </w:t>
+      </w:r>
+      <w:r>
+        <w:rPr>
+          <w:b/>
+          <w:bCs/>
+          <w:rtl/>
+        </w:rPr>
+        <w:t xml:space="preserve">להעלאת קובץ </w:t>
+      </w:r>
+      <w:r>
+        <w:rPr>
+          <w:b/>
+          <w:bCs/>
+        </w:rPr>
+        <w:t xml:space="preserve">– </w:t>
+      </w:r>
+      <w:r>
+        <w:rPr>
+          <w:b/>
+          <w:bCs/>
+          <w:rtl/>
+        </w:rPr>
+        <w:t>שימוש ב</w:t>
+      </w:r>
+      <w:r>
+        <w:rPr>
+          <w:b/>
+          <w:bCs/>
+        </w:rPr>
+        <w:t>-Multer (</w:t>
+      </w:r>
+      <w:r>
+        <w:rPr>
+          <w:b/>
+          <w:bCs/>
+          <w:rtl/>
+        </w:rPr>
+        <w:t>ב</w:t>
+      </w:r>
+      <w:r>
+        <w:rPr>
+          <w:b/>
+          <w:bCs/>
+        </w:rPr>
+        <w:t xml:space="preserve">-Node.js) </w:t>
+      </w:r>
+      <w:r>
+        <w:rPr>
+          <w:b/>
+          <w:bCs/>
+          <w:rtl/>
+        </w:rPr>
+        <w:t xml:space="preserve">או </w:t>
+      </w:r>
+      <w:proofErr w:type="spellStart"/>
+      <w:r>
+        <w:rPr>
+          <w:b/>
+          <w:bCs/>
+        </w:rPr>
+        <w:t>IFormFile</w:t>
+      </w:r>
+      <w:proofErr w:type="spellEnd"/>
+      <w:r>
+        <w:rPr>
+          <w:b/>
+          <w:bCs/>
+        </w:rPr>
+        <w:t xml:space="preserve"> (</w:t>
+      </w:r>
+      <w:r>
+        <w:rPr>
+          <w:b/>
+          <w:bCs/>
+          <w:rtl/>
+        </w:rPr>
+        <w:t>ב</w:t>
+      </w:r>
+      <w:r>
+        <w:rPr>
+          <w:b/>
+          <w:bCs/>
+        </w:rPr>
+        <w:t>-.NET 9).</w:t>
+      </w:r>
+      <w:r>
+        <w:rPr>
+          <w:b/>
+          <w:bCs/>
+        </w:rPr>
+        <w:br/>
+      </w:r>
+      <w:r>
+        <w:rPr>
+          <w:rFonts w:ascii="Segoe UI Emoji" w:hAnsi="Segoe UI Emoji" w:cs="Segoe UI Emoji"/>
+          <w:b/>
+          <w:bCs/>
+        </w:rPr>
+        <w:t>✅</w:t>
+      </w:r>
+      <w:r>
+        <w:rPr>
+          <w:b/>
+          <w:bCs/>
+        </w:rPr>
+        <w:t xml:space="preserve"> </w:t>
+      </w:r>
+      <w:r>
+        <w:rPr>
+          <w:b/>
+          <w:bCs/>
+          <w:rtl/>
+        </w:rPr>
+        <w:t xml:space="preserve">שמירת נתונים בטבלת </w:t>
+      </w:r>
+      <w:r>
+        <w:rPr>
+          <w:b/>
+          <w:bCs/>
+        </w:rPr>
+        <w:t>Files:</w:t>
+      </w:r>
+    </w:p>
+    <w:p>
+      <w:pPr>
+        <w:numPr>
+          <w:ilvl w:val="0"/>
+          <w:numId w:val="2"/>
+        </w:numPr>
+        <w:jc w:val="center"/>
+        <w:rPr>
+          <w:b/>
+          <w:bCs/>
+        </w:rPr>
+      </w:pPr>
+      <w:r>
+        <w:rPr>
+          <w:b/>
+          <w:bCs/>
+          <w:rtl/>
+        </w:rPr>
+        <w:t>שם הקובץ</w:t>
+      </w:r>
+    </w:p>
+    <w:p>
+      <w:pPr>
+        <w:numPr>
+          <w:ilvl w:val="0"/>
+          <w:numId w:val="2"/>
+        </w:numPr>
+        <w:jc w:val="center"/>
+        <w:rPr>
+          <w:b/>
+          <w:bCs/>
+        </w:rPr>
+      </w:pPr>
+      <w:r>
+        <w:rPr>
+          <w:b/>
+          <w:bCs/>
+          <w:rtl/>
+        </w:rPr>
+        <w:lastRenderedPageBreak/>
+        <w:t>סוג הקובץ</w:t>
+      </w:r>
+    </w:p>
+    <w:p>
+      <w:pPr>
+        <w:numPr>
+          <w:ilvl w:val="0"/>
+          <w:numId w:val="2"/>
+        </w:numPr>
+        <w:jc w:val="center"/>
+        <w:rPr>
+          <w:b/>
+          <w:bCs/>
+        </w:rPr>
+      </w:pPr>
+      <w:r>
+        <w:rPr>
+          <w:b/>
+          <w:bCs/>
+          <w:rtl/>
+        </w:rPr>
+        <w:t>גודל</w:t>
+      </w:r>
+    </w:p>
+    <w:p>
+      <w:pPr>
+        <w:numPr>
+          <w:ilvl w:val="0"/>
+          <w:numId w:val="2"/>
+        </w:numPr>
+        <w:jc w:val="center"/>
+        <w:rPr>
+          <w:b/>
+          <w:bCs/>
+        </w:rPr>
+      </w:pPr>
+      <w:r>
+        <w:rPr>
+          <w:b/>
+          <w:bCs/>
+          <w:rtl/>
+        </w:rPr>
+        <w:t>כתובת האחסון</w:t>
+      </w:r>
+      <w:r>
+        <w:rPr>
+          <w:b/>
+          <w:bCs/>
+        </w:rPr>
+        <w:t xml:space="preserve"> (</w:t>
+      </w:r>
+      <w:proofErr w:type="spellStart"/>
+      <w:r>
+        <w:rPr>
+          <w:b/>
+          <w:bCs/>
+        </w:rPr>
+        <w:t>storage_url</w:t>
+      </w:r>
+      <w:proofErr w:type="spellEnd"/>
+      <w:r>
+        <w:rPr>
+          <w:b/>
+          <w:bCs/>
+        </w:rPr>
+        <w:t>)</w:t>
+      </w:r>
+    </w:p>
+    <w:p>
+      <w:pPr>
+        <w:numPr>
+          <w:ilvl w:val="0"/>
+          <w:numId w:val="2"/>
+        </w:numPr>
+        <w:jc w:val="center"/>
+        <w:rPr>
+          <w:b/>
+          <w:bCs/>
+        </w:rPr>
+      </w:pPr>
+      <w:r>
+        <w:rPr>
+          <w:b/>
+          <w:bCs/>
+          <w:rtl/>
+        </w:rPr>
+        <w:t>תאריך העלאה</w:t>
+      </w:r>
+    </w:p>
+    <w:p>
+      <w:pPr>
+        <w:jc w:val="center"/>
+        <w:rPr>
+          <w:b/>
+          <w:bCs/>
+        </w:rPr>
+      </w:pPr>
+      <w:r>
+        <w:rPr>
+          <w:b/>
+          <w:bCs/>
+        </w:rPr>
+        <w:t>2️</w:t>
+      </w:r>
+      <w:r>
+        <w:rPr>
+          <w:rFonts w:ascii="Segoe UI Symbol" w:hAnsi="Segoe UI Symbol" w:cs="Segoe UI Symbol"/>
+          <w:b/>
+          <w:bCs/>
+        </w:rPr>
+        <w:t>⃣</w:t>
+      </w:r>
+      <w:r>
+        <w:rPr>
+          <w:b/>
+          <w:bCs/>
+        </w:rPr>
+        <w:t xml:space="preserve"> Frontend - </w:t>
+      </w:r>
+      <w:r>
+        <w:rPr>
+          <w:b/>
+          <w:bCs/>
+          <w:rtl/>
+        </w:rPr>
+        <w:t>ממשק משתמש להעלאת קבצים</w:t>
+      </w:r>
+      <w:r>
+        <w:rPr>
+          <w:b/>
+          <w:bCs/>
+        </w:rPr>
+        <w:br/>
+      </w:r>
+      <w:r>
+        <w:rPr>
+          <w:rFonts w:ascii="Segoe UI Emoji" w:hAnsi="Segoe UI Emoji" w:cs="Segoe UI Emoji"/>
+          <w:b/>
+          <w:bCs/>
+        </w:rPr>
+        <w:t>✅</w:t>
+      </w:r>
+      <w:r>
+        <w:rPr>
+          <w:b/>
+          <w:bCs/>
+        </w:rPr>
+        <w:t xml:space="preserve"> </w:t>
+      </w:r>
+      <w:r>
+        <w:rPr>
+          <w:b/>
+          <w:bCs/>
+          <w:rtl/>
+        </w:rPr>
+        <w:t>יצירת דף</w:t>
+      </w:r>
+      <w:r>
+        <w:rPr>
+          <w:b/>
+          <w:bCs/>
+        </w:rPr>
+        <w:t xml:space="preserve"> React </w:t>
+      </w:r>
+      <w:r>
+        <w:rPr>
+          <w:b/>
+          <w:bCs/>
+          <w:rtl/>
+        </w:rPr>
+        <w:t>שבו המשתמש יכול לגרור ולשחרר קבצים או לבחור קובץ</w:t>
+      </w:r>
+      <w:r>
+        <w:rPr>
+          <w:b/>
+          <w:bCs/>
+        </w:rPr>
+        <w:t>.</w:t>
+      </w:r>
+      <w:r>
+        <w:rPr>
+          <w:b/>
+          <w:bCs/>
+        </w:rPr>
+        <w:br/>
+      </w:r>
+      <w:r>
+        <w:rPr>
+          <w:rFonts w:ascii="Segoe UI Emoji" w:hAnsi="Segoe UI Emoji" w:cs="Segoe UI Emoji"/>
+          <w:b/>
+          <w:bCs/>
+        </w:rPr>
+        <w:t>✅</w:t>
+      </w:r>
+      <w:r>
+        <w:rPr>
+          <w:b/>
+          <w:bCs/>
+        </w:rPr>
+        <w:t xml:space="preserve"> </w:t>
+      </w:r>
+      <w:r>
+        <w:rPr>
+          <w:b/>
+          <w:bCs/>
+          <w:rtl/>
+        </w:rPr>
+        <w:t>חיבור ל</w:t>
+      </w:r>
+      <w:r>
+        <w:rPr>
+          <w:b/>
+          <w:bCs/>
+        </w:rPr>
+        <w:t xml:space="preserve">-API </w:t>
+      </w:r>
+      <w:r>
+        <w:rPr>
+          <w:b/>
+          <w:bCs/>
+          <w:rtl/>
+        </w:rPr>
+        <w:t>כדי לשלוח את הקובץ לשרת</w:t>
+      </w:r>
+      <w:r>
+        <w:rPr>
+          <w:b/>
+          <w:bCs/>
+        </w:rPr>
+        <w:t>.</w:t>
+      </w:r>
+      <w:r>
+        <w:rPr>
+          <w:b/>
+          <w:bCs/>
+        </w:rPr>
+        <w:br/>
+      </w:r>
+      <w:r>
+        <w:rPr>
+          <w:rFonts w:ascii="Segoe UI Emoji" w:hAnsi="Segoe UI Emoji" w:cs="Segoe UI Emoji"/>
+          <w:b/>
+          <w:bCs/>
+        </w:rPr>
+        <w:t>✅</w:t>
+      </w:r>
+      <w:r>
+        <w:rPr>
+          <w:b/>
+          <w:bCs/>
+        </w:rPr>
+        <w:t xml:space="preserve"> </w:t>
+      </w:r>
+      <w:r>
+        <w:rPr>
+          <w:b/>
+          <w:bCs/>
+          <w:rtl/>
+        </w:rPr>
+        <w:t>הצגת רשימת הקבצים שהועלו במערכת</w:t>
+      </w:r>
+      <w:r>
+        <w:rPr>
+          <w:b/>
+          <w:bCs/>
+        </w:rPr>
+        <w:t>.</w:t>
+      </w:r>
+    </w:p>
+    <w:p>
+      <w:pPr>
+        <w:jc w:val="center"/>
+        <w:rPr>
+          <w:b/>
+          <w:bCs/>
+        </w:rPr>
+      </w:pPr>
+      <w:r>
+        <w:rPr>
+          <w:b/>
+          <w:bCs/>
+        </w:rPr>
+        <w:t>3️</w:t>
+      </w:r>
+      <w:r>
+        <w:rPr>
+          <w:rFonts w:ascii="Segoe UI Symbol" w:hAnsi="Segoe UI Symbol" w:cs="Segoe UI Symbol"/>
+          <w:b/>
+          <w:bCs/>
+        </w:rPr>
+        <w:t>⃣</w:t>
+      </w:r>
+      <w:r>
+        <w:rPr>
+          <w:b/>
+          <w:bCs/>
+        </w:rPr>
+        <w:t xml:space="preserve"> </w:t>
+      </w:r>
+      <w:r>
+        <w:rPr>
+          <w:b/>
+          <w:bCs/>
+          <w:rtl/>
+        </w:rPr>
+        <w:t>שילוב מסד הנתונים</w:t>
+      </w:r>
+      <w:r>
+        <w:rPr>
+          <w:b/>
+          <w:bCs/>
+        </w:rPr>
+        <w:t xml:space="preserve"> (Clever Cloud - MySQL)</w:t>
+      </w:r>
+      <w:r>
+        <w:rPr>
+          <w:b/>
+          <w:bCs/>
+        </w:rPr>
+        <w:br/>
+      </w:r>
+      <w:r>
+        <w:rPr>
+          <w:rFonts w:ascii="Segoe UI Emoji" w:hAnsi="Segoe UI Emoji" w:cs="Segoe UI Emoji"/>
+          <w:b/>
+          <w:bCs/>
+        </w:rPr>
+        <w:t>✅</w:t>
+      </w:r>
+      <w:r>
+        <w:rPr>
+          <w:b/>
+          <w:bCs/>
+        </w:rPr>
+        <w:t xml:space="preserve"> </w:t>
+      </w:r>
+      <w:r>
+        <w:rPr>
+          <w:b/>
+          <w:bCs/>
+          <w:rtl/>
+        </w:rPr>
+        <w:t>חיבור ה</w:t>
+      </w:r>
+      <w:r>
+        <w:rPr>
+          <w:b/>
+          <w:bCs/>
+        </w:rPr>
+        <w:t xml:space="preserve">-Backend </w:t>
+      </w:r>
+      <w:r>
+        <w:rPr>
+          <w:b/>
+          <w:bCs/>
+          <w:rtl/>
+        </w:rPr>
+        <w:t>למסד הנתונים ב</w:t>
+      </w:r>
+      <w:r>
+        <w:rPr>
+          <w:b/>
+          <w:bCs/>
+        </w:rPr>
+        <w:t>-Clever Cloud.</w:t>
+      </w:r>
+      <w:r>
+        <w:rPr>
+          <w:b/>
+          <w:bCs/>
+        </w:rPr>
+        <w:br/>
+      </w:r>
+      <w:r>
+        <w:rPr>
+          <w:rFonts w:ascii="Segoe UI Emoji" w:hAnsi="Segoe UI Emoji" w:cs="Segoe UI Emoji"/>
+          <w:b/>
+          <w:bCs/>
+        </w:rPr>
+        <w:t>✅</w:t>
+      </w:r>
+      <w:r>
+        <w:rPr>
+          <w:b/>
+          <w:bCs/>
+        </w:rPr>
+        <w:t xml:space="preserve"> </w:t>
+      </w:r>
+      <w:r>
+        <w:rPr>
+          <w:b/>
+          <w:bCs/>
+          <w:rtl/>
+        </w:rPr>
+        <w:t>בדיקות שהקבצים נשמרים כראוי</w:t>
+      </w:r>
+      <w:r>
+        <w:rPr>
+          <w:b/>
+          <w:bCs/>
+        </w:rPr>
+        <w:t>.</w:t>
+      </w:r>
+    </w:p>
+    <w:p>
+      <w:pPr>
+        <w:jc w:val="center"/>
+        <w:rPr>
+          <w:b/>
+          <w:bCs/>
+        </w:rPr>
+      </w:pPr>
+      <w:r>
+        <w:rPr>
+          <w:rFonts w:ascii="Segoe UI Emoji" w:hAnsi="Segoe UI Emoji" w:cs="Segoe UI Emoji"/>
+          <w:b/>
+          <w:bCs/>
+        </w:rPr>
+        <w:t>📌</w:t>
+      </w:r>
+      <w:r>
+        <w:rPr>
+          <w:b/>
+          <w:bCs/>
+        </w:rPr>
+        <w:t xml:space="preserve"> </w:t>
+      </w:r>
+      <w:r>
+        <w:rPr>
+          <w:b/>
+          <w:bCs/>
+          <w:rtl/>
+        </w:rPr>
+        <w:t>תוצאה</w:t>
+      </w:r>
+      <w:r>
+        <w:rPr>
+          <w:b/>
+          <w:bCs/>
+        </w:rPr>
+        <w:t xml:space="preserve">: </w:t>
+      </w:r>
+      <w:r>
+        <w:rPr>
+          <w:b/>
+          <w:bCs/>
+          <w:rtl/>
+        </w:rPr>
+        <w:t>המשתמש יכול להעלות קבצים</w:t>
+      </w:r>
+      <w:r>
+        <w:rPr>
+          <w:b/>
+          <w:bCs/>
+        </w:rPr>
+        <w:t xml:space="preserve">, </w:t>
+      </w:r>
+      <w:r>
+        <w:rPr>
+          <w:b/>
+          <w:bCs/>
+          <w:rtl/>
+        </w:rPr>
+        <w:t>לראות את רשימת הקבצים שהעלה, ולנהל אותם (למשל, מחיקה)</w:t>
+      </w:r>
+      <w:r>
+        <w:rPr>
+          <w:b/>
+          <w:bCs/>
+        </w:rPr>
+        <w:t>.</w:t>
+      </w:r>
+    </w:p>
+    <w:p>
+      <w:pPr>
+        <w:jc w:val="center"/>
+        <w:rPr>
+          <w:b/>
+          <w:bCs/>
+        </w:rPr>
+      </w:pPr>
+      <w:r>
+        <w:rPr>
+          <w:b/>
+          <w:bCs/>
+        </w:rPr>
+        <w:pict w14:anchorId="151E3B19">
+          <v:rect id="_x0000_i1067" style="width:0;height:1.5pt" o:hralign="center" o:hrstd="t" o:hr="t" fillcolor="#a0a0a0" stroked="f"/>
+        </w:pict>
+      </w:r>
+    </w:p>
+    <w:p>
+      <w:pPr>
+        <w:jc w:val="center"/>
+        <w:rPr>
+          <w:b/>
+          <w:bCs/>
+        </w:rPr>
+      </w:pPr>
+      <w:r>
+        <w:rPr>
+          <w:rFonts w:ascii="Segoe UI Emoji" w:hAnsi="Segoe UI Emoji" w:cs="Segoe UI Emoji"/>
+          <w:b/>
+          <w:bCs/>
+        </w:rPr>
+        <w:t>🔹</w:t>
+      </w:r>
+      <w:r>
+        <w:rPr>
+          <w:b/>
+          <w:bCs/>
+        </w:rPr>
+        <w:t xml:space="preserve"> </w:t>
+      </w:r>
+      <w:r>
+        <w:rPr>
+          <w:b/>
+          <w:bCs/>
+          <w:rtl/>
+        </w:rPr>
+        <w:t>ספרינט 2: תיוג אוטומטי מבוסס</w:t>
+      </w:r>
+      <w:r>
+        <w:rPr>
+          <w:b/>
+          <w:bCs/>
+        </w:rPr>
+        <w:t xml:space="preserve"> AI (AI-Powered Tagging System)</w:t>
+      </w:r>
+    </w:p>
+    <w:p>
+      <w:pPr>
+        <w:jc w:val="center"/>
+        <w:rPr>
+          <w:b/>
+          <w:bCs/>
+        </w:rPr>
+      </w:pPr>
+      <w:r>
+        <w:rPr>
+          <w:rFonts w:ascii="Segoe UI Emoji" w:hAnsi="Segoe UI Emoji" w:cs="Segoe UI Emoji"/>
+          <w:b/>
+          <w:bCs/>
+        </w:rPr>
+        <w:t>📌</w:t>
+      </w:r>
+      <w:r>
+        <w:rPr>
+          <w:b/>
+          <w:bCs/>
+        </w:rPr>
+        <w:t xml:space="preserve"> </w:t>
+      </w:r>
+      <w:r>
+        <w:rPr>
+          <w:b/>
+          <w:bCs/>
+          <w:rtl/>
+        </w:rPr>
+        <w:t>מטרה</w:t>
+      </w:r>
+      <w:r>
+        <w:rPr>
+          <w:b/>
+          <w:bCs/>
+        </w:rPr>
+        <w:t xml:space="preserve">: </w:t>
+      </w:r>
+      <w:r>
+        <w:rPr>
+          <w:b/>
+          <w:bCs/>
+          <w:rtl/>
+        </w:rPr>
+        <w:t>פיתוח מערכת תיוג חכמה שמנתחת תוכן קבצים ומוסיפה תגיות אוטומטיות לפי קטגוריות שנקבעו</w:t>
+      </w:r>
+      <w:r>
+        <w:rPr>
+          <w:b/>
+          <w:bCs/>
+        </w:rPr>
+        <w:t>.</w:t>
+      </w:r>
+    </w:p>
+    <w:p>
+      <w:pPr>
+        <w:jc w:val="center"/>
+        <w:rPr>
+          <w:b/>
+          <w:bCs/>
+        </w:rPr>
+      </w:pPr>
+      <w:r>
+        <w:rPr>
+          <w:rFonts w:ascii="Segoe UI Emoji" w:hAnsi="Segoe UI Emoji" w:cs="Segoe UI Emoji"/>
+          <w:b/>
+          <w:bCs/>
+        </w:rPr>
+        <w:t>🔹</w:t>
+      </w:r>
+      <w:r>
+        <w:rPr>
+          <w:b/>
+          <w:bCs/>
+        </w:rPr>
+        <w:t xml:space="preserve"> </w:t>
+      </w:r>
+      <w:r>
+        <w:rPr>
+          <w:b/>
+          <w:bCs/>
+          <w:rtl/>
+        </w:rPr>
+        <w:t>משימות בספרינט זה</w:t>
+      </w:r>
+      <w:r>
+        <w:rPr>
+          <w:b/>
+          <w:bCs/>
+        </w:rPr>
+        <w:t>:</w:t>
+      </w:r>
+    </w:p>
+    <w:p>
+      <w:pPr>
+        <w:jc w:val="center"/>
+        <w:rPr>
+          <w:b/>
+          <w:bCs/>
+        </w:rPr>
+      </w:pPr>
+      <w:r>
+        <w:rPr>
+          <w:b/>
+          <w:bCs/>
+        </w:rPr>
+        <w:t>1️</w:t>
+      </w:r>
+      <w:r>
+        <w:rPr>
+          <w:rFonts w:ascii="Segoe UI Symbol" w:hAnsi="Segoe UI Symbol" w:cs="Segoe UI Symbol"/>
+          <w:b/>
+          <w:bCs/>
+        </w:rPr>
+        <w:t>⃣</w:t>
+      </w:r>
+      <w:r>
+        <w:rPr>
+          <w:b/>
+          <w:bCs/>
+        </w:rPr>
+        <w:t xml:space="preserve"> Backend - </w:t>
+      </w:r>
+      <w:r>
+        <w:rPr>
+          <w:b/>
+          <w:bCs/>
+          <w:rtl/>
+        </w:rPr>
+        <w:t>יצירת מודול</w:t>
+      </w:r>
+      <w:r>
+        <w:rPr>
+          <w:b/>
+          <w:bCs/>
+        </w:rPr>
+        <w:t xml:space="preserve"> NLP </w:t>
+      </w:r>
+      <w:r>
+        <w:rPr>
+          <w:b/>
+          <w:bCs/>
+          <w:rtl/>
+        </w:rPr>
+        <w:t>לתיוג אוטומטי</w:t>
+      </w:r>
+      <w:r>
+        <w:rPr>
+          <w:b/>
+          <w:bCs/>
+        </w:rPr>
+        <w:br/>
+      </w:r>
+      <w:r>
+        <w:rPr>
+          <w:rFonts w:ascii="Segoe UI Emoji" w:hAnsi="Segoe UI Emoji" w:cs="Segoe UI Emoji"/>
+          <w:b/>
+          <w:bCs/>
+        </w:rPr>
+        <w:t>✅</w:t>
+      </w:r>
+      <w:r>
+        <w:rPr>
+          <w:b/>
+          <w:bCs/>
+        </w:rPr>
+        <w:t xml:space="preserve"> </w:t>
+      </w:r>
+      <w:r>
+        <w:rPr>
+          <w:b/>
+          <w:bCs/>
+          <w:rtl/>
+        </w:rPr>
+        <w:t>חיבור מערכת ה</w:t>
+      </w:r>
+      <w:r>
+        <w:rPr>
+          <w:b/>
+          <w:bCs/>
+        </w:rPr>
+        <w:t xml:space="preserve">-NLP </w:t>
+      </w:r>
+      <w:r>
+        <w:rPr>
+          <w:b/>
+          <w:bCs/>
+          <w:rtl/>
+        </w:rPr>
+        <w:t>לזיהוי תוכן במסמכים (למשל</w:t>
+      </w:r>
+      <w:r>
+        <w:rPr>
+          <w:b/>
+          <w:bCs/>
+        </w:rPr>
+        <w:t xml:space="preserve">, Python </w:t>
+      </w:r>
+      <w:r>
+        <w:rPr>
+          <w:b/>
+          <w:bCs/>
+          <w:rtl/>
+        </w:rPr>
+        <w:t xml:space="preserve">עם ספריית </w:t>
+      </w:r>
+      <w:proofErr w:type="spellStart"/>
+      <w:r>
+        <w:rPr>
+          <w:b/>
+          <w:bCs/>
+        </w:rPr>
+        <w:t>spaCy</w:t>
+      </w:r>
+      <w:proofErr w:type="spellEnd"/>
+      <w:r>
+        <w:rPr>
+          <w:b/>
+          <w:bCs/>
+        </w:rPr>
+        <w:t xml:space="preserve"> </w:t>
+      </w:r>
+      <w:r>
+        <w:rPr>
+          <w:b/>
+          <w:bCs/>
+          <w:rtl/>
+        </w:rPr>
+        <w:t xml:space="preserve">או </w:t>
+      </w:r>
+      <w:r>
+        <w:rPr>
+          <w:b/>
+          <w:bCs/>
+        </w:rPr>
+        <w:t>OpenAI API).</w:t>
+      </w:r>
+      <w:r>
+        <w:rPr>
+          <w:b/>
+          <w:bCs/>
+        </w:rPr>
+        <w:br/>
+      </w:r>
+      <w:r>
+        <w:rPr>
+          <w:rFonts w:ascii="Segoe UI Emoji" w:hAnsi="Segoe UI Emoji" w:cs="Segoe UI Emoji"/>
+          <w:b/>
+          <w:bCs/>
+        </w:rPr>
+        <w:t>✅</w:t>
+      </w:r>
+      <w:r>
+        <w:rPr>
+          <w:b/>
+          <w:bCs/>
+        </w:rPr>
+        <w:t xml:space="preserve"> </w:t>
+      </w:r>
+      <w:r>
+        <w:rPr>
+          <w:b/>
+          <w:bCs/>
+          <w:rtl/>
+        </w:rPr>
+        <w:t>יצירת פונקציה שמקבלת קובץ</w:t>
+      </w:r>
+      <w:r>
+        <w:rPr>
+          <w:b/>
+          <w:bCs/>
+        </w:rPr>
+        <w:t xml:space="preserve"> PDF / Word, </w:t>
+      </w:r>
+      <w:r>
+        <w:rPr>
+          <w:b/>
+          <w:bCs/>
+          <w:rtl/>
+        </w:rPr>
+        <w:t>מנתחת את הטקסט, ומחלצת מילות מפתח חשובות</w:t>
+      </w:r>
+      <w:r>
+        <w:rPr>
+          <w:b/>
+          <w:bCs/>
+        </w:rPr>
+        <w:t>.</w:t>
+      </w:r>
+      <w:r>
+        <w:rPr>
+          <w:b/>
+          <w:bCs/>
+        </w:rPr>
+        <w:br/>
+      </w:r>
+      <w:r>
+        <w:rPr>
+          <w:rFonts w:ascii="Segoe UI Emoji" w:hAnsi="Segoe UI Emoji" w:cs="Segoe UI Emoji"/>
+          <w:b/>
+          <w:bCs/>
+        </w:rPr>
+        <w:t>✅</w:t>
+      </w:r>
+      <w:r>
+        <w:rPr>
+          <w:b/>
+          <w:bCs/>
+        </w:rPr>
+        <w:t xml:space="preserve"> </w:t>
+      </w:r>
+      <w:r>
+        <w:rPr>
+          <w:b/>
+          <w:bCs/>
+          <w:rtl/>
+        </w:rPr>
+        <w:t xml:space="preserve">שמירת התגיות בטבלת </w:t>
+      </w:r>
+      <w:r>
+        <w:rPr>
+          <w:b/>
+          <w:bCs/>
+        </w:rPr>
+        <w:t xml:space="preserve">Tags </w:t>
+      </w:r>
+      <w:r>
+        <w:rPr>
+          <w:b/>
+          <w:bCs/>
+          <w:rtl/>
+        </w:rPr>
+        <w:t xml:space="preserve">ושיוך לקובץ בטבלת </w:t>
+      </w:r>
+      <w:proofErr w:type="spellStart"/>
+      <w:r>
+        <w:rPr>
+          <w:b/>
+          <w:bCs/>
+        </w:rPr>
+        <w:t>FileTags</w:t>
+      </w:r>
+      <w:proofErr w:type="spellEnd"/>
+      <w:r>
+        <w:rPr>
+          <w:b/>
+          <w:bCs/>
+        </w:rPr>
+        <w:t>.</w:t>
+      </w:r>
+      <w:r>
+        <w:rPr>
+          <w:b/>
+          <w:bCs/>
+        </w:rPr>
+        <w:br/>
+      </w:r>
+      <w:r>
+        <w:rPr>
+          <w:rFonts w:ascii="Segoe UI Emoji" w:hAnsi="Segoe UI Emoji" w:cs="Segoe UI Emoji"/>
+          <w:b/>
+          <w:bCs/>
+        </w:rPr>
+        <w:t>✅</w:t>
+      </w:r>
+      <w:r>
+        <w:rPr>
+          <w:b/>
+          <w:bCs/>
+        </w:rPr>
+        <w:t xml:space="preserve"> </w:t>
+      </w:r>
+      <w:r>
+        <w:rPr>
+          <w:b/>
+          <w:bCs/>
+          <w:rtl/>
+        </w:rPr>
+        <w:t xml:space="preserve">יצירת </w:t>
+      </w:r>
+      <w:r>
+        <w:rPr>
+          <w:b/>
+          <w:bCs/>
+        </w:rPr>
+        <w:t xml:space="preserve">API </w:t>
+      </w:r>
+      <w:r>
+        <w:rPr>
+          <w:b/>
+          <w:bCs/>
+          <w:rtl/>
+        </w:rPr>
+        <w:t>חדש שמחזיר תגיות אוטומטיות לכל קובץ</w:t>
+      </w:r>
+      <w:r>
+        <w:rPr>
+          <w:b/>
+          <w:bCs/>
+        </w:rPr>
+        <w:t>.</w:t>
+      </w:r>
+    </w:p>
+    <w:p>
+      <w:pPr>
+        <w:jc w:val="center"/>
+        <w:rPr>
+          <w:b/>
+          <w:bCs/>
+        </w:rPr>
+      </w:pPr>
+      <w:r>
+        <w:rPr>
+          <w:b/>
+          <w:bCs/>
+        </w:rPr>
+        <w:t>2️</w:t>
+      </w:r>
+      <w:r>
+        <w:rPr>
+          <w:rFonts w:ascii="Segoe UI Symbol" w:hAnsi="Segoe UI Symbol" w:cs="Segoe UI Symbol"/>
+          <w:b/>
+          <w:bCs/>
+        </w:rPr>
+        <w:t>⃣</w:t>
+      </w:r>
+      <w:r>
+        <w:rPr>
+          <w:b/>
+          <w:bCs/>
+        </w:rPr>
+        <w:t xml:space="preserve"> Frontend - </w:t>
+      </w:r>
+      <w:r>
+        <w:rPr>
+          <w:b/>
+          <w:bCs/>
+          <w:rtl/>
+        </w:rPr>
+        <w:t>הצגת תגיות למשתמש</w:t>
+      </w:r>
+      <w:r>
+        <w:rPr>
+          <w:b/>
+          <w:bCs/>
+        </w:rPr>
+        <w:br/>
+      </w:r>
+      <w:r>
+        <w:rPr>
+          <w:rFonts w:ascii="Segoe UI Emoji" w:hAnsi="Segoe UI Emoji" w:cs="Segoe UI Emoji"/>
+          <w:b/>
+          <w:bCs/>
+        </w:rPr>
+        <w:t>✅</w:t>
+      </w:r>
+      <w:r>
+        <w:rPr>
+          <w:b/>
+          <w:bCs/>
+        </w:rPr>
+        <w:t xml:space="preserve"> </w:t>
+      </w:r>
+      <w:r>
+        <w:rPr>
+          <w:b/>
+          <w:bCs/>
+          <w:rtl/>
+        </w:rPr>
+        <w:t>עדכון מסך הקבצים כך שיציג את התגיות האוטומטיות לצד כל קובץ</w:t>
+      </w:r>
+      <w:r>
+        <w:rPr>
+          <w:b/>
+          <w:bCs/>
+        </w:rPr>
+        <w:t>.</w:t>
+      </w:r>
+      <w:r>
+        <w:rPr>
+          <w:b/>
+          <w:bCs/>
+        </w:rPr>
+        <w:br/>
+      </w:r>
+      <w:r>
+        <w:rPr>
+          <w:rFonts w:ascii="Segoe UI Emoji" w:hAnsi="Segoe UI Emoji" w:cs="Segoe UI Emoji"/>
+          <w:b/>
+          <w:bCs/>
+        </w:rPr>
+        <w:t>✅</w:t>
+      </w:r>
+      <w:r>
+        <w:rPr>
+          <w:b/>
+          <w:bCs/>
+        </w:rPr>
+        <w:t xml:space="preserve"> </w:t>
+      </w:r>
+      <w:r>
+        <w:rPr>
+          <w:b/>
+          <w:bCs/>
+          <w:rtl/>
+        </w:rPr>
+        <w:t>יצירת כפתור "ערוך תגיות</w:t>
+      </w:r>
+      <w:r>
+        <w:rPr>
+          <w:b/>
+          <w:bCs/>
+        </w:rPr>
+        <w:t xml:space="preserve">" </w:t>
+      </w:r>
+      <w:r>
+        <w:rPr>
+          <w:b/>
+          <w:bCs/>
+          <w:rtl/>
+        </w:rPr>
+        <w:t>למשתמש (שיופעל בספרינט הבא)</w:t>
+      </w:r>
+      <w:r>
+        <w:rPr>
+          <w:b/>
+          <w:bCs/>
+        </w:rPr>
+        <w:t>.</w:t>
+      </w:r>
+    </w:p>
+    <w:p>
+      <w:pPr>
+        <w:jc w:val="center"/>
+        <w:rPr>
+          <w:b/>
+          <w:bCs/>
+        </w:rPr>
+      </w:pPr>
+      <w:r>
+        <w:rPr>
+          <w:rFonts w:ascii="Segoe UI Emoji" w:hAnsi="Segoe UI Emoji" w:cs="Segoe UI Emoji"/>
+          <w:b/>
+          <w:bCs/>
+        </w:rPr>
+        <w:t>📌</w:t>
+      </w:r>
+      <w:r>
+        <w:rPr>
+          <w:b/>
+          <w:bCs/>
+        </w:rPr>
+        <w:t xml:space="preserve"> </w:t>
+      </w:r>
+      <w:r>
+        <w:rPr>
+          <w:b/>
+          <w:bCs/>
+          <w:rtl/>
+        </w:rPr>
+        <w:t>תוצאה</w:t>
+      </w:r>
+      <w:r>
+        <w:rPr>
+          <w:b/>
+          <w:bCs/>
+        </w:rPr>
+        <w:t xml:space="preserve">: </w:t>
+      </w:r>
+      <w:r>
+        <w:rPr>
+          <w:b/>
+          <w:bCs/>
+          <w:rtl/>
+        </w:rPr>
+        <w:t>כל קובץ שהועלה יקבל תגיות אוטומטיות בהתאם לתוכן שלו</w:t>
+      </w:r>
+      <w:r>
+        <w:rPr>
+          <w:b/>
+          <w:bCs/>
+        </w:rPr>
+        <w:t>.</w:t>
+      </w:r>
+    </w:p>
+    <w:p>
+      <w:pPr>
+        <w:jc w:val="center"/>
+        <w:rPr>
+          <w:b/>
+          <w:bCs/>
+        </w:rPr>
+      </w:pPr>
+      <w:r>
+        <w:rPr>
+          <w:b/>
+          <w:bCs/>
+        </w:rPr>
+        <w:pict w14:anchorId="43CDDC63">
+          <v:rect id="_x0000_i1068" style="width:0;height:1.5pt" o:hralign="center" o:hrstd="t" o:hr="t" fillcolor="#a0a0a0" stroked="f"/>
+        </w:pict>
+      </w:r>
+    </w:p>
+    <w:p>
+      <w:pPr>
+        <w:jc w:val="center"/>
+        <w:rPr>
+          <w:b/>
+          <w:bCs/>
+        </w:rPr>
+      </w:pPr>
+      <w:r>
+        <w:rPr>
+          <w:rFonts w:ascii="Segoe UI Emoji" w:hAnsi="Segoe UI Emoji" w:cs="Segoe UI Emoji"/>
+          <w:b/>
+          <w:bCs/>
+        </w:rPr>
+        <w:t>🔹</w:t>
+      </w:r>
+      <w:r>
+        <w:rPr>
+          <w:b/>
+          <w:bCs/>
+        </w:rPr>
+        <w:t xml:space="preserve"> </w:t>
+      </w:r>
+      <w:r>
+        <w:rPr>
+          <w:b/>
+          <w:bCs/>
+          <w:rtl/>
+        </w:rPr>
+        <w:t>ספרינט 3: חיפוש מתקדם ועריכת תגיות</w:t>
+      </w:r>
+      <w:r>
+        <w:rPr>
+          <w:b/>
+          <w:bCs/>
+        </w:rPr>
+        <w:t xml:space="preserve"> (Advanced Search &amp; Tag Editing)</w:t>
+      </w:r>
+    </w:p>
+    <w:p>
+      <w:pPr>
+        <w:jc w:val="center"/>
+        <w:rPr>
+          <w:b/>
+          <w:bCs/>
+        </w:rPr>
+      </w:pPr>
+      <w:r>
+        <w:rPr>
+          <w:rFonts w:ascii="Segoe UI Emoji" w:hAnsi="Segoe UI Emoji" w:cs="Segoe UI Emoji"/>
+          <w:b/>
+          <w:bCs/>
+        </w:rPr>
+        <w:t>📌</w:t>
+      </w:r>
+      <w:r>
+        <w:rPr>
+          <w:b/>
+          <w:bCs/>
+        </w:rPr>
+        <w:t xml:space="preserve"> </w:t>
+      </w:r>
+      <w:r>
+        <w:rPr>
+          <w:b/>
+          <w:bCs/>
+          <w:rtl/>
+        </w:rPr>
+        <w:t>מטרה</w:t>
+      </w:r>
+      <w:r>
+        <w:rPr>
+          <w:b/>
+          <w:bCs/>
+        </w:rPr>
+        <w:t xml:space="preserve">: </w:t>
+      </w:r>
+      <w:r>
+        <w:rPr>
+          <w:b/>
+          <w:bCs/>
+          <w:rtl/>
+        </w:rPr>
+        <w:t>הוספת מערכת חיפוש מתקדמת ויכולת למשתמש לערוך תגיות באופן ידני</w:t>
+      </w:r>
+      <w:r>
+        <w:rPr>
+          <w:b/>
+          <w:bCs/>
+        </w:rPr>
+        <w:t>.</w:t>
+      </w:r>
+    </w:p>
+    <w:p>
+      <w:pPr>
+        <w:jc w:val="center"/>
+        <w:rPr>
+          <w:b/>
+          <w:bCs/>
+        </w:rPr>
+      </w:pPr>
+      <w:r>
+        <w:rPr>
+          <w:rFonts w:ascii="Segoe UI Emoji" w:hAnsi="Segoe UI Emoji" w:cs="Segoe UI Emoji"/>
+          <w:b/>
+          <w:bCs/>
+        </w:rPr>
+        <w:t>🔹</w:t>
+      </w:r>
+      <w:r>
+        <w:rPr>
+          <w:b/>
+          <w:bCs/>
+        </w:rPr>
+        <w:t xml:space="preserve"> </w:t>
+      </w:r>
+      <w:r>
+        <w:rPr>
+          <w:b/>
+          <w:bCs/>
+          <w:rtl/>
+        </w:rPr>
+        <w:t>משימות בספרינט זה</w:t>
+      </w:r>
+      <w:r>
+        <w:rPr>
+          <w:b/>
+          <w:bCs/>
+        </w:rPr>
+        <w:t>:</w:t>
+      </w:r>
+    </w:p>
+    <w:p>
+      <w:pPr>
+        <w:jc w:val="center"/>
+        <w:rPr>
+          <w:b/>
+          <w:bCs/>
+        </w:rPr>
+      </w:pPr>
+      <w:r>
+        <w:rPr>
+          <w:b/>
+          <w:bCs/>
+        </w:rPr>
+        <w:t>1️</w:t>
+      </w:r>
+      <w:r>
+        <w:rPr>
+          <w:rFonts w:ascii="Segoe UI Symbol" w:hAnsi="Segoe UI Symbol" w:cs="Segoe UI Symbol"/>
+          <w:b/>
+          <w:bCs/>
+        </w:rPr>
+        <w:t>⃣</w:t>
+      </w:r>
+      <w:r>
+        <w:rPr>
+          <w:b/>
+          <w:bCs/>
+        </w:rPr>
+        <w:t xml:space="preserve"> Backend - API </w:t>
+      </w:r>
+      <w:r>
+        <w:rPr>
+          <w:b/>
+          <w:bCs/>
+          <w:rtl/>
+        </w:rPr>
+        <w:t>לחיפוש מתקדם</w:t>
+      </w:r>
+      <w:r>
+        <w:rPr>
+          <w:b/>
+          <w:bCs/>
+        </w:rPr>
+        <w:br/>
+      </w:r>
+      <w:r>
+        <w:rPr>
+          <w:rFonts w:ascii="Segoe UI Emoji" w:hAnsi="Segoe UI Emoji" w:cs="Segoe UI Emoji"/>
+          <w:b/>
+          <w:bCs/>
+        </w:rPr>
+        <w:t>✅</w:t>
+      </w:r>
+      <w:r>
+        <w:rPr>
+          <w:b/>
+          <w:bCs/>
+        </w:rPr>
+        <w:t xml:space="preserve"> </w:t>
+      </w:r>
+      <w:r>
+        <w:rPr>
+          <w:b/>
+          <w:bCs/>
+          <w:rtl/>
+        </w:rPr>
+        <w:t xml:space="preserve">יצירת שאילתת חיפוש חכמה </w:t>
+      </w:r>
+      <w:r>
+        <w:rPr>
+          <w:b/>
+          <w:bCs/>
+        </w:rPr>
+        <w:t xml:space="preserve">(LIKE %query%) </w:t>
+      </w:r>
+      <w:r>
+        <w:rPr>
+          <w:b/>
+          <w:bCs/>
+          <w:rtl/>
+        </w:rPr>
+        <w:t>שמאפשרת חיפוש לפי</w:t>
+      </w:r>
+      <w:r>
+        <w:rPr>
+          <w:b/>
+          <w:bCs/>
+        </w:rPr>
+        <w:t>:</w:t>
+      </w:r>
+    </w:p>
+    <w:p>
+      <w:pPr>
+        <w:numPr>
+          <w:ilvl w:val="0"/>
+          <w:numId w:val="3"/>
+        </w:numPr>
+        <w:jc w:val="center"/>
+        <w:rPr>
+          <w:b/>
+          <w:bCs/>
+        </w:rPr>
+      </w:pPr>
+      <w:r>
+        <w:rPr>
+          <w:b/>
+          <w:bCs/>
+          <w:rtl/>
+        </w:rPr>
+        <w:lastRenderedPageBreak/>
+        <w:t>שם קובץ</w:t>
+      </w:r>
+    </w:p>
+    <w:p>
+      <w:pPr>
+        <w:numPr>
+          <w:ilvl w:val="0"/>
+          <w:numId w:val="3"/>
+        </w:numPr>
+        <w:jc w:val="center"/>
+        <w:rPr>
+          <w:b/>
+          <w:bCs/>
+        </w:rPr>
+      </w:pPr>
+      <w:r>
+        <w:rPr>
+          <w:b/>
+          <w:bCs/>
+          <w:rtl/>
+        </w:rPr>
+        <w:t>תגיות</w:t>
+      </w:r>
+    </w:p>
+    <w:p>
+      <w:pPr>
+        <w:numPr>
+          <w:ilvl w:val="0"/>
+          <w:numId w:val="3"/>
+        </w:numPr>
+        <w:jc w:val="center"/>
+        <w:rPr>
+          <w:b/>
+          <w:bCs/>
+        </w:rPr>
+      </w:pPr>
+      <w:r>
+        <w:rPr>
+          <w:b/>
+          <w:bCs/>
+          <w:rtl/>
+        </w:rPr>
+        <w:t>תאריך העלאה</w:t>
+      </w:r>
+      <w:r>
+        <w:rPr>
+          <w:b/>
+          <w:bCs/>
+        </w:rPr>
+        <w:br/>
+      </w:r>
+      <w:r>
+        <w:rPr>
+          <w:rFonts w:ascii="Segoe UI Emoji" w:hAnsi="Segoe UI Emoji" w:cs="Segoe UI Emoji"/>
+          <w:b/>
+          <w:bCs/>
+        </w:rPr>
+        <w:t>✅</w:t>
+      </w:r>
+      <w:r>
+        <w:rPr>
+          <w:b/>
+          <w:bCs/>
+        </w:rPr>
+        <w:t xml:space="preserve"> </w:t>
+      </w:r>
+      <w:r>
+        <w:rPr>
+          <w:b/>
+          <w:bCs/>
+          <w:rtl/>
+        </w:rPr>
+        <w:t>החזרת רשימת תוצאות מסוננות למשתמש</w:t>
+      </w:r>
+      <w:r>
+        <w:rPr>
+          <w:b/>
+          <w:bCs/>
+        </w:rPr>
+        <w:t>.</w:t>
+      </w:r>
+    </w:p>
+    <w:p>
+      <w:pPr>
+        <w:jc w:val="center"/>
+        <w:rPr>
+          <w:b/>
+          <w:bCs/>
+        </w:rPr>
+      </w:pPr>
+      <w:r>
+        <w:rPr>
+          <w:b/>
+          <w:bCs/>
+        </w:rPr>
+        <w:t>2️</w:t>
+      </w:r>
+      <w:r>
+        <w:rPr>
+          <w:rFonts w:ascii="Segoe UI Symbol" w:hAnsi="Segoe UI Symbol" w:cs="Segoe UI Symbol"/>
+          <w:b/>
+          <w:bCs/>
+        </w:rPr>
+        <w:t>⃣</w:t>
+      </w:r>
+      <w:r>
+        <w:rPr>
+          <w:b/>
+          <w:bCs/>
+        </w:rPr>
+        <w:t xml:space="preserve"> Frontend - </w:t>
+      </w:r>
+      <w:r>
+        <w:rPr>
+          <w:b/>
+          <w:bCs/>
+          <w:rtl/>
+        </w:rPr>
+        <w:t>שדה חיפוש מתקדם</w:t>
+      </w:r>
+      <w:r>
+        <w:rPr>
+          <w:b/>
+          <w:bCs/>
+        </w:rPr>
+        <w:br/>
+      </w:r>
+      <w:r>
+        <w:rPr>
+          <w:rFonts w:ascii="Segoe UI Emoji" w:hAnsi="Segoe UI Emoji" w:cs="Segoe UI Emoji"/>
+          <w:b/>
+          <w:bCs/>
+        </w:rPr>
+        <w:t>✅</w:t>
+      </w:r>
+      <w:r>
+        <w:rPr>
+          <w:b/>
+          <w:bCs/>
+        </w:rPr>
+        <w:t xml:space="preserve"> </w:t>
+      </w:r>
+      <w:r>
+        <w:rPr>
+          <w:b/>
+          <w:bCs/>
+          <w:rtl/>
+        </w:rPr>
+        <w:t>יצירת תיבת חיפוש ב</w:t>
+      </w:r>
+      <w:r>
+        <w:rPr>
+          <w:b/>
+          <w:bCs/>
+        </w:rPr>
+        <w:t xml:space="preserve">-React </w:t>
+      </w:r>
+      <w:r>
+        <w:rPr>
+          <w:b/>
+          <w:bCs/>
+          <w:rtl/>
+        </w:rPr>
+        <w:t>שבה המשתמש יכול להקליד מילים ולסנן תוצאות</w:t>
+      </w:r>
+      <w:r>
+        <w:rPr>
+          <w:b/>
+          <w:bCs/>
+        </w:rPr>
+        <w:t>.</w:t>
+      </w:r>
+      <w:r>
+        <w:rPr>
+          <w:b/>
+          <w:bCs/>
+        </w:rPr>
+        <w:br/>
+      </w:r>
+      <w:r>
+        <w:rPr>
+          <w:rFonts w:ascii="Segoe UI Emoji" w:hAnsi="Segoe UI Emoji" w:cs="Segoe UI Emoji"/>
+          <w:b/>
+          <w:bCs/>
+        </w:rPr>
+        <w:t>✅</w:t>
+      </w:r>
+      <w:r>
+        <w:rPr>
+          <w:b/>
+          <w:bCs/>
+        </w:rPr>
+        <w:t xml:space="preserve"> </w:t>
+      </w:r>
+      <w:r>
+        <w:rPr>
+          <w:b/>
+          <w:bCs/>
+          <w:rtl/>
+        </w:rPr>
+        <w:t xml:space="preserve">הצגת הצעות חיפוש </w:t>
+      </w:r>
+      <w:r>
+        <w:rPr>
+          <w:b/>
+          <w:bCs/>
+        </w:rPr>
+        <w:t xml:space="preserve">(Autocomplete) </w:t>
+      </w:r>
+      <w:r>
+        <w:rPr>
+          <w:b/>
+          <w:bCs/>
+          <w:rtl/>
+        </w:rPr>
+        <w:t>בהתאם לנתונים</w:t>
+      </w:r>
+      <w:r>
+        <w:rPr>
+          <w:b/>
+          <w:bCs/>
+        </w:rPr>
+        <w:t>.</w:t>
+      </w:r>
+    </w:p>
+    <w:p>
+      <w:pPr>
+        <w:jc w:val="center"/>
+        <w:rPr>
+          <w:b/>
+          <w:bCs/>
+        </w:rPr>
+      </w:pPr>
+      <w:r>
+        <w:rPr>
+          <w:b/>
+          <w:bCs/>
+        </w:rPr>
+        <w:t>3️</w:t>
+      </w:r>
+      <w:r>
+        <w:rPr>
+          <w:rFonts w:ascii="Segoe UI Symbol" w:hAnsi="Segoe UI Symbol" w:cs="Segoe UI Symbol"/>
+          <w:b/>
+          <w:bCs/>
+        </w:rPr>
+        <w:t>⃣</w:t>
+      </w:r>
+      <w:r>
+        <w:rPr>
+          <w:b/>
+          <w:bCs/>
+        </w:rPr>
+        <w:t xml:space="preserve"> </w:t>
+      </w:r>
+      <w:r>
+        <w:rPr>
+          <w:b/>
+          <w:bCs/>
+          <w:rtl/>
+        </w:rPr>
+        <w:t>עריכת תגיות ידנית</w:t>
+      </w:r>
+      <w:r>
+        <w:rPr>
+          <w:b/>
+          <w:bCs/>
+        </w:rPr>
+        <w:br/>
+      </w:r>
+      <w:r>
+        <w:rPr>
+          <w:rFonts w:ascii="Segoe UI Emoji" w:hAnsi="Segoe UI Emoji" w:cs="Segoe UI Emoji"/>
+          <w:b/>
+          <w:bCs/>
+        </w:rPr>
+        <w:t>✅</w:t>
+      </w:r>
+      <w:r>
+        <w:rPr>
+          <w:b/>
+          <w:bCs/>
+        </w:rPr>
+        <w:t xml:space="preserve"> </w:t>
+      </w:r>
+      <w:r>
+        <w:rPr>
+          <w:b/>
+          <w:bCs/>
+          <w:rtl/>
+        </w:rPr>
+        <w:t>יצירת ממשק שבו המשתמש יכול להוסיף / להסיר תגיות באופן ידני לכל קובץ</w:t>
+      </w:r>
+      <w:r>
+        <w:rPr>
+          <w:b/>
+          <w:bCs/>
+        </w:rPr>
+        <w:t>.</w:t>
+      </w:r>
+      <w:r>
+        <w:rPr>
+          <w:b/>
+          <w:bCs/>
+        </w:rPr>
+        <w:br/>
+      </w:r>
+      <w:r>
+        <w:rPr>
+          <w:rFonts w:ascii="Segoe UI Emoji" w:hAnsi="Segoe UI Emoji" w:cs="Segoe UI Emoji"/>
+          <w:b/>
+          <w:bCs/>
+        </w:rPr>
+        <w:t>✅</w:t>
+      </w:r>
+      <w:r>
+        <w:rPr>
+          <w:b/>
+          <w:bCs/>
+        </w:rPr>
+        <w:t xml:space="preserve"> </w:t>
+      </w:r>
+      <w:r>
+        <w:rPr>
+          <w:b/>
+          <w:bCs/>
+          <w:rtl/>
+        </w:rPr>
+        <w:t>עדכון ה</w:t>
+      </w:r>
+      <w:r>
+        <w:rPr>
+          <w:b/>
+          <w:bCs/>
+        </w:rPr>
+        <w:t xml:space="preserve">-Backend </w:t>
+      </w:r>
+      <w:r>
+        <w:rPr>
+          <w:b/>
+          <w:bCs/>
+          <w:rtl/>
+        </w:rPr>
+        <w:t>כך שיאפשר עריכת תגיות באמצעות</w:t>
+      </w:r>
+      <w:r>
+        <w:rPr>
+          <w:b/>
+          <w:bCs/>
+        </w:rPr>
+        <w:t xml:space="preserve"> API.</w:t>
+      </w:r>
+    </w:p>
+    <w:p>
+      <w:pPr>
+        <w:jc w:val="center"/>
+        <w:rPr>
+          <w:b/>
+          <w:bCs/>
+        </w:rPr>
+      </w:pPr>
+      <w:r>
+        <w:rPr>
+          <w:rFonts w:ascii="Segoe UI Emoji" w:hAnsi="Segoe UI Emoji" w:cs="Segoe UI Emoji"/>
+          <w:b/>
+          <w:bCs/>
+        </w:rPr>
+        <w:t>📌</w:t>
+      </w:r>
+      <w:r>
+        <w:rPr>
+          <w:b/>
+          <w:bCs/>
+        </w:rPr>
+        <w:t xml:space="preserve"> </w:t>
+      </w:r>
+      <w:r>
+        <w:rPr>
+          <w:b/>
+          <w:bCs/>
+          <w:rtl/>
+        </w:rPr>
+        <w:t>תוצאה</w:t>
+      </w:r>
+      <w:r>
+        <w:rPr>
+          <w:b/>
+          <w:bCs/>
+        </w:rPr>
+        <w:t xml:space="preserve">: </w:t>
+      </w:r>
+      <w:r>
+        <w:rPr>
+          <w:b/>
+          <w:bCs/>
+          <w:rtl/>
+        </w:rPr>
+        <w:t>המשתמש יוכל לחפש בקלות קבצים לפי תוכן ותגיות וגם לערוך תגיות ידנית אם התיוג האוטומטי לא מדויק</w:t>
+      </w:r>
+      <w:r>
+        <w:rPr>
+          <w:b/>
+          <w:bCs/>
+        </w:rPr>
+        <w:t>.</w:t>
+      </w:r>
+    </w:p>
+    <w:p>
+      <w:pPr>
+        <w:jc w:val="center"/>
+        <w:rPr>
+          <w:b/>
+          <w:bCs/>
+        </w:rPr>
+      </w:pPr>
+      <w:r>
+        <w:rPr>
+          <w:b/>
+          <w:bCs/>
+        </w:rPr>
+        <w:pict w14:anchorId="4B8CA58B">
+          <v:rect id="_x0000_i1069" style="width:0;height:1.5pt" o:hralign="center" o:hrstd="t" o:hr="t" fillcolor="#a0a0a0" stroked="f"/>
+        </w:pict>
+      </w:r>
+    </w:p>
+    <w:p>
+      <w:pPr>
+        <w:jc w:val="center"/>
+        <w:rPr>
+          <w:b/>
+          <w:bCs/>
+        </w:rPr>
+      </w:pPr>
+      <w:r>
+        <w:rPr>
+          <w:rFonts w:ascii="Segoe UI Emoji" w:hAnsi="Segoe UI Emoji" w:cs="Segoe UI Emoji"/>
+          <w:b/>
+          <w:bCs/>
+        </w:rPr>
+        <w:t>🔥</w:t>
+      </w:r>
+      <w:r>
+        <w:rPr>
+          <w:b/>
+          <w:bCs/>
+        </w:rPr>
+        <w:t xml:space="preserve"> </w:t>
+      </w:r>
+      <w:r>
+        <w:rPr>
+          <w:b/>
+          <w:bCs/>
+          <w:rtl/>
+        </w:rPr>
+        <w:t>סיכום הספרינטים</w:t>
+      </w:r>
+      <w:r>
+        <w:rPr>
+          <w:b/>
+          <w:bCs/>
+        </w:rPr>
+        <w:t>:</w:t>
+      </w:r>
+    </w:p>
+    <w:tbl>
+      <w:tblPr>
+        <w:tblW w:w="0" w:type="auto"/>
+        <w:tblCellSpacing w:w="15" w:type="dxa"/>
+        <w:tblCellMar>
+          <w:top w:w="15" w:type="dxa"/>
+          <w:left w:w="15" w:type="dxa"/>
+          <w:bottom w:w="15" w:type="dxa"/>
+          <w:right w:w="15" w:type="dxa"/>
+        </w:tblCellMar>
+        <w:tblLook w:val="04A0" w:firstRow="1" w:lastRow="0" w:firstColumn="1" w:lastColumn="0" w:noHBand="0" w:noVBand="1"/>
+      </w:tblPr>
+      <w:tblGrid>
+        <w:gridCol w:w="1272"/>
+        <w:gridCol w:w="1852"/>
+        <w:gridCol w:w="3510"/>
+      </w:tblGrid>
+      <w:tr>
+        <w:trPr>
+          <w:tblHeader/>
+          <w:tblCellSpacing w:w="15" w:type="dxa"/>
+        </w:trPr>
+        <w:tc>
+          <w:tcPr>
+            <w:tcW w:w="0" w:type="auto"/>
+            <w:vAlign w:val="center"/>
+            <w:hideMark/>
+          </w:tcPr>
+          <w:p>
+            <w:pPr>
+              <w:jc w:val="center"/>
+              <w:rPr>
+                <w:b/>
+                <w:bCs/>
+              </w:rPr>
+            </w:pPr>
+            <w:r>
+              <w:rPr>
+                <w:b/>
+                <w:bCs/>
+                <w:rtl/>
+              </w:rPr>
+              <w:t>ספרינט</w:t>
+            </w:r>
+          </w:p>
+        </w:tc>
+        <w:tc>
+          <w:tcPr>
+            <w:tcW w:w="0" w:type="auto"/>
+            <w:vAlign w:val="center"/>
+            <w:hideMark/>
+          </w:tcPr>
+          <w:p>
+            <w:pPr>
+              <w:jc w:val="center"/>
+              <w:rPr>
+                <w:b/>
+                <w:bCs/>
+              </w:rPr>
+            </w:pPr>
+            <w:r>
+              <w:rPr>
+                <w:b/>
+                <w:bCs/>
+                <w:rtl/>
+              </w:rPr>
+              <w:t>פיצ'ר</w:t>
+            </w:r>
+          </w:p>
+        </w:tc>
+        <w:tc>
+          <w:tcPr>
+            <w:tcW w:w="0" w:type="auto"/>
+            <w:vAlign w:val="center"/>
+            <w:hideMark/>
+          </w:tcPr>
+          <w:p>
+            <w:pPr>
+              <w:jc w:val="center"/>
+              <w:rPr>
+                <w:b/>
+                <w:bCs/>
+              </w:rPr>
+            </w:pPr>
+            <w:r>
+              <w:rPr>
+                <w:b/>
+                <w:bCs/>
+                <w:rtl/>
+              </w:rPr>
+              <w:t>תוצאה סופית</w:t>
+            </w:r>
+          </w:p>
+        </w:tc>
+      </w:tr>
+      <w:tr>
+        <w:trPr>
+          <w:tblCellSpacing w:w="15" w:type="dxa"/>
+        </w:trPr>
+        <w:tc>
+          <w:tcPr>
+            <w:tcW w:w="0" w:type="auto"/>
+            <w:vAlign w:val="center"/>
+            <w:hideMark/>
+          </w:tcPr>
+          <w:p>
+            <w:pPr>
+              <w:jc w:val="center"/>
+              <w:rPr>
+                <w:b/>
+                <w:bCs/>
+              </w:rPr>
+            </w:pPr>
+            <w:r>
+              <w:rPr>
+                <w:rFonts w:ascii="Segoe UI Emoji" w:hAnsi="Segoe UI Emoji" w:cs="Segoe UI Emoji"/>
+                <w:b/>
+                <w:bCs/>
+              </w:rPr>
+              <w:t>📂</w:t>
+            </w:r>
+            <w:r>
+              <w:rPr>
+                <w:b/>
+                <w:bCs/>
+              </w:rPr>
+              <w:t xml:space="preserve"> </w:t>
+            </w:r>
+            <w:r>
+              <w:rPr>
+                <w:b/>
+                <w:bCs/>
+                <w:rtl/>
+              </w:rPr>
+              <w:t>ספרינט 1</w:t>
+            </w:r>
+          </w:p>
+        </w:tc>
+        <w:tc>
+          <w:tcPr>
+            <w:tcW w:w="0" w:type="auto"/>
+            <w:vAlign w:val="center"/>
+            <w:hideMark/>
+          </w:tcPr>
+          <w:p>
+            <w:pPr>
+              <w:jc w:val="center"/>
+              <w:rPr>
+                <w:b/>
+                <w:bCs/>
+              </w:rPr>
+            </w:pPr>
+            <w:r>
+              <w:rPr>
+                <w:b/>
+                <w:bCs/>
+                <w:rtl/>
+              </w:rPr>
+              <w:t>העלאת קבצים</w:t>
+            </w:r>
+          </w:p>
+        </w:tc>
+        <w:tc>
+          <w:tcPr>
+            <w:tcW w:w="0" w:type="auto"/>
+            <w:vAlign w:val="center"/>
+            <w:hideMark/>
+          </w:tcPr>
+          <w:p>
+            <w:pPr>
+              <w:jc w:val="center"/>
+              <w:rPr>
+                <w:b/>
+                <w:bCs/>
+              </w:rPr>
+            </w:pPr>
+            <w:r>
+              <w:rPr>
+                <w:b/>
+                <w:bCs/>
+                <w:rtl/>
+              </w:rPr>
+              <w:t>אפשרות להעלות קבצים ולשמור נתונים</w:t>
+            </w:r>
+          </w:p>
+        </w:tc>
+      </w:tr>
+      <w:tr>
+        <w:trPr>
+          <w:tblCellSpacing w:w="15" w:type="dxa"/>
+        </w:trPr>
+        <w:tc>
+          <w:tcPr>
+            <w:tcW w:w="0" w:type="auto"/>
+            <w:vAlign w:val="center"/>
+            <w:hideMark/>
+          </w:tcPr>
+          <w:p>
+            <w:pPr>
+              <w:jc w:val="center"/>
+              <w:rPr>
+                <w:b/>
+                <w:bCs/>
+              </w:rPr>
+            </w:pPr>
+            <w:r>
+              <w:rPr>
+                <w:rFonts w:ascii="Segoe UI Emoji" w:hAnsi="Segoe UI Emoji" w:cs="Segoe UI Emoji"/>
+                <w:b/>
+                <w:bCs/>
+              </w:rPr>
+              <w:t>🧠</w:t>
+            </w:r>
+            <w:r>
+              <w:rPr>
+                <w:b/>
+                <w:bCs/>
+              </w:rPr>
+              <w:t xml:space="preserve"> </w:t>
+            </w:r>
+            <w:r>
+              <w:rPr>
+                <w:b/>
+                <w:bCs/>
+                <w:rtl/>
+              </w:rPr>
+              <w:t>ספרינט 2</w:t>
+            </w:r>
+          </w:p>
+        </w:tc>
+        <w:tc>
+          <w:tcPr>
+            <w:tcW w:w="0" w:type="auto"/>
+            <w:vAlign w:val="center"/>
+            <w:hideMark/>
+          </w:tcPr>
+          <w:p>
+            <w:pPr>
+              <w:jc w:val="center"/>
+              <w:rPr>
+                <w:b/>
+                <w:bCs/>
+              </w:rPr>
+            </w:pPr>
+            <w:r>
+              <w:rPr>
+                <w:b/>
+                <w:bCs/>
+                <w:rtl/>
+              </w:rPr>
+              <w:t>תיוג אוטומטי</w:t>
+            </w:r>
+          </w:p>
+        </w:tc>
+        <w:tc>
+          <w:tcPr>
+            <w:tcW w:w="0" w:type="auto"/>
+            <w:vAlign w:val="center"/>
+            <w:hideMark/>
+          </w:tcPr>
+          <w:p>
+            <w:pPr>
+              <w:jc w:val="center"/>
+              <w:rPr>
+                <w:b/>
+                <w:bCs/>
+              </w:rPr>
+            </w:pPr>
+            <w:r>
+              <w:rPr>
+                <w:b/>
+                <w:bCs/>
+              </w:rPr>
+              <w:t xml:space="preserve">AI </w:t>
+            </w:r>
+            <w:r>
+              <w:rPr>
+                <w:b/>
+                <w:bCs/>
+                <w:rtl/>
+              </w:rPr>
+              <w:t>מנתח קבצים ומוסיף להם תגיות</w:t>
+            </w:r>
+          </w:p>
+        </w:tc>
+      </w:tr>
+      <w:tr>
+        <w:trPr>
+          <w:tblCellSpacing w:w="15" w:type="dxa"/>
+        </w:trPr>
+        <w:tc>
+          <w:tcPr>
+            <w:tcW w:w="0" w:type="auto"/>
+            <w:vAlign w:val="center"/>
+            <w:hideMark/>
+          </w:tcPr>
+          <w:p>
+            <w:pPr>
+              <w:jc w:val="center"/>
+              <w:rPr>
+                <w:b/>
+                <w:bCs/>
+              </w:rPr>
+            </w:pPr>
+            <w:r>
+              <w:rPr>
+                <w:rFonts w:ascii="Segoe UI Emoji" w:hAnsi="Segoe UI Emoji" w:cs="Segoe UI Emoji"/>
+                <w:b/>
+                <w:bCs/>
+              </w:rPr>
+              <w:t>🔎</w:t>
+            </w:r>
+            <w:r>
+              <w:rPr>
+                <w:b/>
+                <w:bCs/>
+              </w:rPr>
+              <w:t xml:space="preserve"> </w:t>
+            </w:r>
+            <w:r>
+              <w:rPr>
+                <w:b/>
+                <w:bCs/>
+                <w:rtl/>
+              </w:rPr>
+              <w:t>ספרינט 3</w:t>
+            </w:r>
+          </w:p>
+        </w:tc>
+        <w:tc>
+          <w:tcPr>
+            <w:tcW w:w="0" w:type="auto"/>
+            <w:vAlign w:val="center"/>
+            <w:hideMark/>
+          </w:tcPr>
+          <w:p>
+            <w:pPr>
+              <w:jc w:val="center"/>
+              <w:rPr>
+                <w:b/>
+                <w:bCs/>
+              </w:rPr>
+            </w:pPr>
+            <w:r>
+              <w:rPr>
+                <w:b/>
+                <w:bCs/>
+                <w:rtl/>
+              </w:rPr>
+              <w:t>חיפוש ועריכת תגיות</w:t>
+            </w:r>
+          </w:p>
+        </w:tc>
+        <w:tc>
+          <w:tcPr>
+            <w:tcW w:w="0" w:type="auto"/>
+            <w:vAlign w:val="center"/>
+            <w:hideMark/>
+          </w:tcPr>
+          <w:p>
+            <w:pPr>
+              <w:jc w:val="center"/>
+              <w:rPr>
+                <w:b/>
+                <w:bCs/>
+              </w:rPr>
+            </w:pPr>
+            <w:r>
+              <w:rPr>
+                <w:b/>
+                <w:bCs/>
+                <w:rtl/>
+              </w:rPr>
+              <w:t>חיפוש חכם ועריכה ידנית של תגיות</w:t>
+            </w:r>
+          </w:p>
+        </w:tc>
+      </w:tr>
+    </w:tbl>
+    <w:p>
+      <w:pPr>
+        <w:jc w:val="center"/>
+        <w:rPr>
+          <w:b/>
+          <w:bCs/>
+        </w:rPr>
+      </w:pPr>
+      <w:r>
+        <w:rPr>
+          <w:rFonts w:ascii="Segoe UI Emoji" w:hAnsi="Segoe UI Emoji" w:cs="Segoe UI Emoji"/>
+          <w:b/>
+          <w:bCs/>
+        </w:rPr>
+        <w:t>💡</w:t>
+      </w:r>
+      <w:r>
+        <w:rPr>
+          <w:b/>
+          <w:bCs/>
+        </w:rPr>
+        <w:t xml:space="preserve"> </w:t>
+      </w:r>
+      <w:r>
+        <w:rPr>
+          <w:b/>
+          <w:bCs/>
+          <w:rtl/>
+        </w:rPr>
+        <w:t>לכל ספרינט יהיה ענף ב</w:t>
+      </w:r>
+      <w:r>
+        <w:rPr>
+          <w:b/>
+          <w:bCs/>
+        </w:rPr>
+        <w:t xml:space="preserve">-GitHub, </w:t>
+      </w:r>
+      <w:r>
+        <w:rPr>
+          <w:b/>
+          <w:bCs/>
+          <w:rtl/>
+        </w:rPr>
+        <w:t>למשל</w:t>
+      </w:r>
+      <w:r>
+        <w:rPr>
+          <w:b/>
+          <w:bCs/>
+        </w:rPr>
+        <w:t>:</w:t>
+      </w:r>
+      <w:r>
+        <w:rPr>
+          <w:b/>
+          <w:bCs/>
+        </w:rPr>
+        <w:br/>
+      </w:r>
+      <w:r>
+        <w:rPr>
+          <w:rFonts w:ascii="Segoe UI Emoji" w:hAnsi="Segoe UI Emoji" w:cs="Segoe UI Emoji"/>
+          <w:b/>
+          <w:bCs/>
+        </w:rPr>
+        <w:t>📌</w:t>
+      </w:r>
+      <w:r>
+        <w:rPr>
+          <w:b/>
+          <w:bCs/>
+        </w:rPr>
+        <w:t xml:space="preserve"> feature/file-upload (</w:t>
+      </w:r>
+      <w:r>
+        <w:rPr>
+          <w:b/>
+          <w:bCs/>
+          <w:rtl/>
+        </w:rPr>
+        <w:t>לספרינט 1</w:t>
+      </w:r>
+      <w:r>
+        <w:rPr>
+          <w:b/>
+          <w:bCs/>
+        </w:rPr>
+        <w:t>)</w:t>
+      </w:r>
+      <w:r>
+        <w:rPr>
+          <w:b/>
+          <w:bCs/>
+        </w:rPr>
+        <w:br/>
+      </w:r>
+      <w:r>
+        <w:rPr>
+          <w:rFonts w:ascii="Segoe UI Emoji" w:hAnsi="Segoe UI Emoji" w:cs="Segoe UI Emoji"/>
+          <w:b/>
+          <w:bCs/>
+        </w:rPr>
+        <w:t>📌</w:t>
+      </w:r>
+      <w:r>
+        <w:rPr>
+          <w:b/>
+          <w:bCs/>
+        </w:rPr>
+        <w:t xml:space="preserve"> feature/auto-tagging (</w:t>
+      </w:r>
+      <w:r>
+        <w:rPr>
+          <w:b/>
+          <w:bCs/>
+          <w:rtl/>
+        </w:rPr>
+        <w:t>לספרינט 2</w:t>
+      </w:r>
+      <w:r>
+        <w:rPr>
+          <w:b/>
+          <w:bCs/>
+        </w:rPr>
+        <w:t>)</w:t>
+      </w:r>
+      <w:r>
+        <w:rPr>
+          <w:b/>
+          <w:bCs/>
+        </w:rPr>
+        <w:br/>
+      </w:r>
+      <w:r>
+        <w:rPr>
+          <w:rFonts w:ascii="Segoe UI Emoji" w:hAnsi="Segoe UI Emoji" w:cs="Segoe UI Emoji"/>
+          <w:b/>
+          <w:bCs/>
+        </w:rPr>
+        <w:t>📌</w:t>
+      </w:r>
+      <w:r>
+        <w:rPr>
+          <w:b/>
+          <w:bCs/>
+        </w:rPr>
+        <w:t xml:space="preserve"> feature/advanced-search (</w:t>
+      </w:r>
+      <w:r>
+        <w:rPr>
+          <w:b/>
+          <w:bCs/>
+          <w:rtl/>
+        </w:rPr>
+        <w:t>לספרינט 3</w:t>
+      </w:r>
+      <w:r>
+        <w:rPr>
+          <w:b/>
+          <w:bCs/>
+        </w:rPr>
+        <w:t>)</w:t>
+      </w:r>
+    </w:p>
+    <w:p>
+      <w:pPr>
+        <w:jc w:val="center"/>
+        <w:rPr>
+          <w:rFonts w:hint="cs"/>
+          <w:b/>
+          <w:bCs/>
+          <w:rtl/>
         </w:rPr>
       </w:pPr>
     </w:p>
@@ -2248,9 +5338,9 @@
 <file path=word/numbering.xml><?xml version="1.0" encoding="utf-8"?>
 <w:numbering xmlns:wpc="http://schemas.microsoft.com/office/word/2010/wordprocessingCanvas" xmlns:cx="http://schemas.microsoft.com/office/drawing/2014/chartex" xmlns:cx1="http://schemas.microsoft.com/office/drawing/2015/9/8/chartex" xmlns:cx2="http://schemas.microsoft.com/office/drawing/2015/10/21/chartex" xmlns:cx3="http://schemas.microsoft.com/office/drawing/2016/5/9/chartex" xmlns:cx4="http://schemas.microsoft.com/office/drawing/2016/5/10/chartex" xmlns:cx5="http://schemas.microsoft.com/office/drawing/2016/5/11/chartex" xmlns:cx6="http://schemas.microsoft.com/office/drawing/2016/5/12/chartex" xmlns:cx7="http://schemas.microsoft.com/office/drawing/2016/5/13/chartex" xmlns:cx8="http://schemas.microsoft.com/office/drawing/2016/5/14/chartex" xmlns:mc="http://schemas.openxmlformats.org/markup-compatibility/2006" xmlns:aink="http://schemas.microsoft.com/office/drawing/2016/ink" xmlns:am3d="http://schemas.microsoft.com/office/drawing/2017/model3d" xmlns:o="urn:schemas-microsoft-com:office:office" xmlns:oel="http://schemas.microsoft.com/office/2019/extlst" xmlns:r="http://schemas.openxmlformats.org/officeDocument/2006/relationships" xmlns:m="http://schemas.openxmlformats.org/officeDocument/2006/math" xmlns:v="urn:schemas-microsoft-com:vml" xmlns:wp14="http://schemas.microsoft.com/office/word/2010/wordprocessingDrawing" xmlns:wp="http://schemas.openxmlformats.org/drawingml/2006/wordprocessingDrawing" xmlns:w10="urn:schemas-microsoft-com:office:word" xmlns:w="http://schemas.openxmlformats.org/wordprocessingml/2006/main" xmlns:w14="http://schemas.microsoft.com/office/word/2010/wordml" xmlns:w15="http://schemas.microsoft.com/office/word/2012/wordml" xmlns:w16cex="http://schemas.microsoft.com/office/word/2018/wordml/cex" xmlns:w16cid="http://schemas.microsoft.com/office/word/2016/wordml/cid" xmlns:w16="http://schemas.microsoft.com/office/word/2018/wordml" xmlns:w16du="http://schemas.microsoft.com/office/word/2023/wordml/word16du" xmlns:w16sdtdh="http://schemas.microsoft.com/office/word/2020/wordml/sdtdatahash" xmlns:w16sdtfl="http://schemas.microsoft.com/office/word/2024/wordml/sdtformatlock" xmlns:w16se="http://schemas.microsoft.com/office/word/2015/wordml/symex" xmlns:wpg="http://schemas.microsoft.com/office/word/2010/wordprocessingGroup" xmlns:wpi="http://schemas.microsoft.com/office/word/2010/wordprocessingInk" xmlns:wne="http://schemas.microsoft.com/office/word/2006/wordml" xmlns:wps="http://schemas.microsoft.com/office/word/2010/wordprocessingShape" mc:Ignorable="w14 w15 w16se w16cid w16 w16cex w16sdtdh w16sdtfl w16du wp14">
   <w:abstractNum w:abstractNumId="0" w15:restartNumberingAfterBreak="0">
-    <w:nsid w:val="068969C3"/>
+    <w:nsid w:val="06702496"/>
     <w:multiLevelType w:val="multilevel"/>
-    <w:tmpl w:val="5E869BDA"/>
+    <w:tmpl w:val="9028FC6C"/>
     <w:lvl w:ilvl="0">
       <w:start w:val="1"/>
       <w:numFmt w:val="bullet"/>
@@ -2396,8 +5486,312 @@
       </w:rPr>
     </w:lvl>
   </w:abstractNum>
+  <w:abstractNum w:abstractNumId="1" w15:restartNumberingAfterBreak="0">
+    <w:nsid w:val="068969C3"/>
+    <w:multiLevelType w:val="multilevel"/>
+    <w:tmpl w:val="5E869BDA"/>
+    <w:lvl w:ilvl="0">
+      <w:start w:val="1"/>
+      <w:numFmt w:val="bullet"/>
+      <w:lvlText w:val=""/>
+      <w:lvlJc w:val="left"/>
+      <w:pPr>
+        <w:tabs>
+          <w:tab w:val="num" w:pos="720"/>
+        </w:tabs>
+        <w:ind w:left="720" w:hanging="360"/>
+      </w:pPr>
+      <w:rPr>
+        <w:rFonts w:ascii="Symbol" w:hAnsi="Symbol" w:hint="default"/>
+        <w:sz w:val="20"/>
+      </w:rPr>
+    </w:lvl>
+    <w:lvl w:ilvl="1" w:tentative="1">
+      <w:start w:val="1"/>
+      <w:numFmt w:val="bullet"/>
+      <w:lvlText w:val="o"/>
+      <w:lvlJc w:val="left"/>
+      <w:pPr>
+        <w:tabs>
+          <w:tab w:val="num" w:pos="1440"/>
+        </w:tabs>
+        <w:ind w:left="1440" w:hanging="360"/>
+      </w:pPr>
+      <w:rPr>
+        <w:rFonts w:ascii="Courier New" w:hAnsi="Courier New" w:hint="default"/>
+        <w:sz w:val="20"/>
+      </w:rPr>
+    </w:lvl>
+    <w:lvl w:ilvl="2" w:tentative="1">
+      <w:start w:val="1"/>
+      <w:numFmt w:val="bullet"/>
+      <w:lvlText w:val=""/>
+      <w:lvlJc w:val="left"/>
+      <w:pPr>
+        <w:tabs>
+          <w:tab w:val="num" w:pos="2160"/>
+        </w:tabs>
+        <w:ind w:left="2160" w:hanging="360"/>
+      </w:pPr>
+      <w:rPr>
+        <w:rFonts w:ascii="Wingdings" w:hAnsi="Wingdings" w:hint="default"/>
+        <w:sz w:val="20"/>
+      </w:rPr>
+    </w:lvl>
+    <w:lvl w:ilvl="3" w:tentative="1">
+      <w:start w:val="1"/>
+      <w:numFmt w:val="bullet"/>
+      <w:lvlText w:val=""/>
+      <w:lvlJc w:val="left"/>
+      <w:pPr>
+        <w:tabs>
+          <w:tab w:val="num" w:pos="2880"/>
+        </w:tabs>
+        <w:ind w:left="2880" w:hanging="360"/>
+      </w:pPr>
+      <w:rPr>
+        <w:rFonts w:ascii="Wingdings" w:hAnsi="Wingdings" w:hint="default"/>
+        <w:sz w:val="20"/>
+      </w:rPr>
+    </w:lvl>
+    <w:lvl w:ilvl="4" w:tentative="1">
+      <w:start w:val="1"/>
+      <w:numFmt w:val="bullet"/>
+      <w:lvlText w:val=""/>
+      <w:lvlJc w:val="left"/>
+      <w:pPr>
+        <w:tabs>
+          <w:tab w:val="num" w:pos="3600"/>
+        </w:tabs>
+        <w:ind w:left="3600" w:hanging="360"/>
+      </w:pPr>
+      <w:rPr>
+        <w:rFonts w:ascii="Wingdings" w:hAnsi="Wingdings" w:hint="default"/>
+        <w:sz w:val="20"/>
+      </w:rPr>
+    </w:lvl>
+    <w:lvl w:ilvl="5" w:tentative="1">
+      <w:start w:val="1"/>
+      <w:numFmt w:val="bullet"/>
+      <w:lvlText w:val=""/>
+      <w:lvlJc w:val="left"/>
+      <w:pPr>
+        <w:tabs>
+          <w:tab w:val="num" w:pos="4320"/>
+        </w:tabs>
+        <w:ind w:left="4320" w:hanging="360"/>
+      </w:pPr>
+      <w:rPr>
+        <w:rFonts w:ascii="Wingdings" w:hAnsi="Wingdings" w:hint="default"/>
+        <w:sz w:val="20"/>
+      </w:rPr>
+    </w:lvl>
+    <w:lvl w:ilvl="6" w:tentative="1">
+      <w:start w:val="1"/>
+      <w:numFmt w:val="bullet"/>
+      <w:lvlText w:val=""/>
+      <w:lvlJc w:val="left"/>
+      <w:pPr>
+        <w:tabs>
+          <w:tab w:val="num" w:pos="5040"/>
+        </w:tabs>
+        <w:ind w:left="5040" w:hanging="360"/>
+      </w:pPr>
+      <w:rPr>
+        <w:rFonts w:ascii="Wingdings" w:hAnsi="Wingdings" w:hint="default"/>
+        <w:sz w:val="20"/>
+      </w:rPr>
+    </w:lvl>
+    <w:lvl w:ilvl="7" w:tentative="1">
+      <w:start w:val="1"/>
+      <w:numFmt w:val="bullet"/>
+      <w:lvlText w:val=""/>
+      <w:lvlJc w:val="left"/>
+      <w:pPr>
+        <w:tabs>
+          <w:tab w:val="num" w:pos="5760"/>
+        </w:tabs>
+        <w:ind w:left="5760" w:hanging="360"/>
+      </w:pPr>
+      <w:rPr>
+        <w:rFonts w:ascii="Wingdings" w:hAnsi="Wingdings" w:hint="default"/>
+        <w:sz w:val="20"/>
+      </w:rPr>
+    </w:lvl>
+    <w:lvl w:ilvl="8" w:tentative="1">
+      <w:start w:val="1"/>
+      <w:numFmt w:val="bullet"/>
+      <w:lvlText w:val=""/>
+      <w:lvlJc w:val="left"/>
+      <w:pPr>
+        <w:tabs>
+          <w:tab w:val="num" w:pos="6480"/>
+        </w:tabs>
+        <w:ind w:left="6480" w:hanging="360"/>
+      </w:pPr>
+      <w:rPr>
+        <w:rFonts w:ascii="Wingdings" w:hAnsi="Wingdings" w:hint="default"/>
+        <w:sz w:val="20"/>
+      </w:rPr>
+    </w:lvl>
+  </w:abstractNum>
+  <w:abstractNum w:abstractNumId="2" w15:restartNumberingAfterBreak="0">
+    <w:nsid w:val="70D4467A"/>
+    <w:multiLevelType w:val="multilevel"/>
+    <w:tmpl w:val="174C361A"/>
+    <w:lvl w:ilvl="0">
+      <w:start w:val="1"/>
+      <w:numFmt w:val="bullet"/>
+      <w:lvlText w:val=""/>
+      <w:lvlJc w:val="left"/>
+      <w:pPr>
+        <w:tabs>
+          <w:tab w:val="num" w:pos="720"/>
+        </w:tabs>
+        <w:ind w:left="720" w:hanging="360"/>
+      </w:pPr>
+      <w:rPr>
+        <w:rFonts w:ascii="Symbol" w:hAnsi="Symbol" w:hint="default"/>
+        <w:sz w:val="20"/>
+      </w:rPr>
+    </w:lvl>
+    <w:lvl w:ilvl="1" w:tentative="1">
+      <w:start w:val="1"/>
+      <w:numFmt w:val="bullet"/>
+      <w:lvlText w:val="o"/>
+      <w:lvlJc w:val="left"/>
+      <w:pPr>
+        <w:tabs>
+          <w:tab w:val="num" w:pos="1440"/>
+        </w:tabs>
+        <w:ind w:left="1440" w:hanging="360"/>
+      </w:pPr>
+      <w:rPr>
+        <w:rFonts w:ascii="Courier New" w:hAnsi="Courier New" w:hint="default"/>
+        <w:sz w:val="20"/>
+      </w:rPr>
+    </w:lvl>
+    <w:lvl w:ilvl="2" w:tentative="1">
+      <w:start w:val="1"/>
+      <w:numFmt w:val="bullet"/>
+      <w:lvlText w:val=""/>
+      <w:lvlJc w:val="left"/>
+      <w:pPr>
+        <w:tabs>
+          <w:tab w:val="num" w:pos="2160"/>
+        </w:tabs>
+        <w:ind w:left="2160" w:hanging="360"/>
+      </w:pPr>
+      <w:rPr>
+        <w:rFonts w:ascii="Wingdings" w:hAnsi="Wingdings" w:hint="default"/>
+        <w:sz w:val="20"/>
+      </w:rPr>
+    </w:lvl>
+    <w:lvl w:ilvl="3" w:tentative="1">
+      <w:start w:val="1"/>
+      <w:numFmt w:val="bullet"/>
+      <w:lvlText w:val=""/>
+      <w:lvlJc w:val="left"/>
+      <w:pPr>
+        <w:tabs>
+          <w:tab w:val="num" w:pos="2880"/>
+        </w:tabs>
+        <w:ind w:left="2880" w:hanging="360"/>
+      </w:pPr>
+      <w:rPr>
+        <w:rFonts w:ascii="Wingdings" w:hAnsi="Wingdings" w:hint="default"/>
+        <w:sz w:val="20"/>
+      </w:rPr>
+    </w:lvl>
+    <w:lvl w:ilvl="4" w:tentative="1">
+      <w:start w:val="1"/>
+      <w:numFmt w:val="bullet"/>
+      <w:lvlText w:val=""/>
+      <w:lvlJc w:val="left"/>
+      <w:pPr>
+        <w:tabs>
+          <w:tab w:val="num" w:pos="3600"/>
+        </w:tabs>
+        <w:ind w:left="3600" w:hanging="360"/>
+      </w:pPr>
+      <w:rPr>
+        <w:rFonts w:ascii="Wingdings" w:hAnsi="Wingdings" w:hint="default"/>
+        <w:sz w:val="20"/>
+      </w:rPr>
+    </w:lvl>
+    <w:lvl w:ilvl="5" w:tentative="1">
+      <w:start w:val="1"/>
+      <w:numFmt w:val="bullet"/>
+      <w:lvlText w:val=""/>
+      <w:lvlJc w:val="left"/>
+      <w:pPr>
+        <w:tabs>
+          <w:tab w:val="num" w:pos="4320"/>
+        </w:tabs>
+        <w:ind w:left="4320" w:hanging="360"/>
+      </w:pPr>
+      <w:rPr>
+        <w:rFonts w:ascii="Wingdings" w:hAnsi="Wingdings" w:hint="default"/>
+        <w:sz w:val="20"/>
+      </w:rPr>
+    </w:lvl>
+    <w:lvl w:ilvl="6" w:tentative="1">
+      <w:start w:val="1"/>
+      <w:numFmt w:val="bullet"/>
+      <w:lvlText w:val=""/>
+      <w:lvlJc w:val="left"/>
+      <w:pPr>
+        <w:tabs>
+          <w:tab w:val="num" w:pos="5040"/>
+        </w:tabs>
+        <w:ind w:left="5040" w:hanging="360"/>
+      </w:pPr>
+      <w:rPr>
+        <w:rFonts w:ascii="Wingdings" w:hAnsi="Wingdings" w:hint="default"/>
+        <w:sz w:val="20"/>
+      </w:rPr>
+    </w:lvl>
+    <w:lvl w:ilvl="7" w:tentative="1">
+      <w:start w:val="1"/>
+      <w:numFmt w:val="bullet"/>
+      <w:lvlText w:val=""/>
+      <w:lvlJc w:val="left"/>
+      <w:pPr>
+        <w:tabs>
+          <w:tab w:val="num" w:pos="5760"/>
+        </w:tabs>
+        <w:ind w:left="5760" w:hanging="360"/>
+      </w:pPr>
+      <w:rPr>
+        <w:rFonts w:ascii="Wingdings" w:hAnsi="Wingdings" w:hint="default"/>
+        <w:sz w:val="20"/>
+      </w:rPr>
+    </w:lvl>
+    <w:lvl w:ilvl="8" w:tentative="1">
+      <w:start w:val="1"/>
+      <w:numFmt w:val="bullet"/>
+      <w:lvlText w:val=""/>
+      <w:lvlJc w:val="left"/>
+      <w:pPr>
+        <w:tabs>
+          <w:tab w:val="num" w:pos="6480"/>
+        </w:tabs>
+        <w:ind w:left="6480" w:hanging="360"/>
+      </w:pPr>
+      <w:rPr>
+        <w:rFonts w:ascii="Wingdings" w:hAnsi="Wingdings" w:hint="default"/>
+        <w:sz w:val="20"/>
+      </w:rPr>
+    </w:lvl>
+  </w:abstractNum>
   <w:num w:numId="1" w16cid:durableId="1380130264">
+    <w:abstractNumId w:val="1"/>
+  </w:num>
+  <w:num w:numId="2" w16cid:durableId="963077726">
     <w:abstractNumId w:val="0"/>
+  </w:num>
+  <w:num w:numId="3" w16cid:durableId="2050521831">
+    <w:abstractNumId w:val="2"/>
   </w:num>
 </w:numbering>
 </file>

</xml_diff>